<commit_message>
Pha yêu cầu sửa theo nhận xét của thầy
</commit_message>
<xml_diff>
--- a/N06-13-Quản lý nhà hàng Karaoke-Pha yêu cầu.docx
+++ b/N06-13-Quản lý nhà hàng Karaoke-Pha yêu cầu.docx
@@ -1756,7 +1756,21 @@
                 <w:rStyle w:val="Hyperlink"/>
                 <w:noProof/>
               </w:rPr>
-              <w:t>Câu 3: Các chức năng hoạt động như thế nào:</w:t>
+              <w:t>Câu 3: Các chức năng ho</w:t>
+            </w:r>
+            <w:r>
+              <w:rPr>
+                <w:rStyle w:val="Hyperlink"/>
+                <w:noProof/>
+              </w:rPr>
+              <w:t>ạ</w:t>
+            </w:r>
+            <w:r>
+              <w:rPr>
+                <w:rStyle w:val="Hyperlink"/>
+                <w:noProof/>
+              </w:rPr>
+              <w:t>t động như thế nào:</w:t>
             </w:r>
             <w:r>
               <w:rPr>
@@ -1830,7 +1844,21 @@
                 <w:rStyle w:val="Hyperlink"/>
                 <w:noProof/>
               </w:rPr>
-              <w:t>Câu 4: Các thông tin cần thiết:</w:t>
+              <w:t>Câu 4: Các thôn</w:t>
+            </w:r>
+            <w:r>
+              <w:rPr>
+                <w:rStyle w:val="Hyperlink"/>
+                <w:noProof/>
+              </w:rPr>
+              <w:t>g</w:t>
+            </w:r>
+            <w:r>
+              <w:rPr>
+                <w:rStyle w:val="Hyperlink"/>
+                <w:noProof/>
+              </w:rPr>
+              <w:t xml:space="preserve"> tin cần thiết:</w:t>
             </w:r>
             <w:r>
               <w:rPr>
@@ -1871,7 +1899,7 @@
                 <w:noProof/>
                 <w:webHidden/>
               </w:rPr>
-              <w:t>16</w:t>
+              <w:t>17</w:t>
             </w:r>
             <w:r>
               <w:rPr>
@@ -1904,7 +1932,21 @@
                 <w:rStyle w:val="Hyperlink"/>
                 <w:noProof/>
               </w:rPr>
-              <w:t>Câu 5: Mối quan hệ giữa các thông tin:</w:t>
+              <w:t>Câu 5: Mối q</w:t>
+            </w:r>
+            <w:r>
+              <w:rPr>
+                <w:rStyle w:val="Hyperlink"/>
+                <w:noProof/>
+              </w:rPr>
+              <w:t>u</w:t>
+            </w:r>
+            <w:r>
+              <w:rPr>
+                <w:rStyle w:val="Hyperlink"/>
+                <w:noProof/>
+              </w:rPr>
+              <w:t>an hệ giữa các thông tin:</w:t>
             </w:r>
             <w:r>
               <w:rPr>
@@ -1965,6 +2007,77 @@
             </w:tabs>
             <w:ind w:left="284" w:firstLine="0"/>
             <w:rPr>
+              <w:noProof/>
+            </w:rPr>
+          </w:pPr>
+          <w:hyperlink w:anchor="_Toc223433150" w:history="1">
+            <w:r>
+              <w:rPr>
+                <w:rStyle w:val="Hyperlink"/>
+                <w:noProof/>
+                <w:lang w:val="vi"/>
+              </w:rPr>
+              <w:t>III.</w:t>
+            </w:r>
+            <w:r>
+              <w:rPr>
+                <w:rFonts w:asciiTheme="minorHAnsi" w:eastAsiaTheme="minorEastAsia" w:hAnsiTheme="minorHAnsi" w:cstheme="minorBidi"/>
+                <w:noProof/>
+                <w:kern w:val="2"/>
+                <w:sz w:val="24"/>
+                <w:szCs w:val="24"/>
+                <w14:ligatures w14:val="standardContextual"/>
+              </w:rPr>
+              <w:tab/>
+            </w:r>
+            <w:r>
+              <w:rPr>
+                <w:rStyle w:val="Hyperlink"/>
+                <w:noProof/>
+                <w:spacing w:val="-4"/>
+              </w:rPr>
+              <w:t>Mô hình n</w:t>
+            </w:r>
+            <w:r>
+              <w:rPr>
+                <w:rStyle w:val="Hyperlink"/>
+                <w:noProof/>
+                <w:spacing w:val="-4"/>
+              </w:rPr>
+              <w:t>g</w:t>
+            </w:r>
+            <w:r>
+              <w:rPr>
+                <w:rStyle w:val="Hyperlink"/>
+                <w:noProof/>
+                <w:spacing w:val="-4"/>
+              </w:rPr>
+              <w:t>hiệp vụ bằng UML:</w:t>
+            </w:r>
+            <w:r>
+              <w:rPr>
+                <w:noProof/>
+                <w:webHidden/>
+              </w:rPr>
+              <w:tab/>
+            </w:r>
+            <w:r>
+              <w:rPr>
+                <w:noProof/>
+                <w:webHidden/>
+              </w:rPr>
+              <w:t>20</w:t>
+            </w:r>
+          </w:hyperlink>
+        </w:p>
+        <w:p>
+          <w:pPr>
+            <w:pStyle w:val="TOC3"/>
+            <w:tabs>
+              <w:tab w:val="left" w:pos="1101"/>
+              <w:tab w:val="right" w:leader="dot" w:pos="10070"/>
+            </w:tabs>
+            <w:rPr>
               <w:rFonts w:asciiTheme="minorHAnsi" w:eastAsiaTheme="minorEastAsia" w:hAnsiTheme="minorHAnsi" w:cstheme="minorBidi"/>
               <w:noProof/>
               <w:kern w:val="2"/>
@@ -1973,14 +2086,15 @@
               <w14:ligatures w14:val="standardContextual"/>
             </w:rPr>
           </w:pPr>
-          <w:hyperlink w:anchor="_Toc223433150" w:history="1">
+          <w:hyperlink w:anchor="_Toc223971579" w:history="1">
             <w:r>
               <w:rPr>
                 <w:rStyle w:val="Hyperlink"/>
+                <w:rFonts w:ascii="Sitka Text" w:eastAsia="Sitka Text" w:hAnsi="Sitka Text" w:cs="Sitka Text"/>
                 <w:noProof/>
                 <w:lang w:val="vi"/>
               </w:rPr>
-              <w:t>III.</w:t>
+              <w:t>-</w:t>
             </w:r>
             <w:r>
               <w:rPr>
@@ -1989,6 +2103,7 @@
                 <w:kern w:val="2"/>
                 <w:sz w:val="24"/>
                 <w:szCs w:val="24"/>
+                <w:lang w:val="en-US"/>
                 <w14:ligatures w14:val="standardContextual"/>
               </w:rPr>
               <w:tab/>
@@ -1999,7 +2114,31 @@
                 <w:noProof/>
                 <w:spacing w:val="-4"/>
               </w:rPr>
-              <w:t>Mô hình nghiệp vụ bằng UML:</w:t>
+              <w:t>Use</w:t>
+            </w:r>
+            <w:r>
+              <w:rPr>
+                <w:rStyle w:val="Hyperlink"/>
+                <w:noProof/>
+                <w:spacing w:val="-4"/>
+              </w:rPr>
+              <w:t xml:space="preserve"> </w:t>
+            </w:r>
+            <w:r>
+              <w:rPr>
+                <w:rStyle w:val="Hyperlink"/>
+                <w:noProof/>
+                <w:spacing w:val="-4"/>
+              </w:rPr>
+              <w:t>c</w:t>
+            </w:r>
+            <w:r>
+              <w:rPr>
+                <w:rStyle w:val="Hyperlink"/>
+                <w:noProof/>
+                <w:spacing w:val="-4"/>
+              </w:rPr>
+              <w:t>ase tổng quan:</w:t>
             </w:r>
             <w:r>
               <w:rPr>
@@ -2020,7 +2159,7 @@
                 <w:noProof/>
                 <w:webHidden/>
               </w:rPr>
-              <w:instrText xml:space="preserve"> PAGEREF _Toc223433150 \h </w:instrText>
+              <w:instrText xml:space="preserve"> PAGEREF _Toc223971579 \h </w:instrText>
             </w:r>
             <w:r>
               <w:rPr>
@@ -2040,7 +2179,135 @@
                 <w:noProof/>
                 <w:webHidden/>
               </w:rPr>
-              <w:t>19</w:t>
+              <w:t>20</w:t>
+            </w:r>
+            <w:r>
+              <w:rPr>
+                <w:noProof/>
+                <w:webHidden/>
+              </w:rPr>
+              <w:fldChar w:fldCharType="end"/>
+            </w:r>
+          </w:hyperlink>
+        </w:p>
+        <w:p>
+          <w:pPr>
+            <w:pStyle w:val="TOC3"/>
+            <w:tabs>
+              <w:tab w:val="left" w:pos="1101"/>
+              <w:tab w:val="right" w:leader="dot" w:pos="10070"/>
+            </w:tabs>
+            <w:rPr>
+              <w:rFonts w:asciiTheme="minorHAnsi" w:eastAsiaTheme="minorEastAsia" w:hAnsiTheme="minorHAnsi" w:cstheme="minorBidi"/>
+              <w:noProof/>
+              <w:kern w:val="2"/>
+              <w:sz w:val="24"/>
+              <w:szCs w:val="24"/>
+              <w14:ligatures w14:val="standardContextual"/>
+            </w:rPr>
+          </w:pPr>
+          <w:hyperlink w:anchor="_Toc223971579" w:history="1">
+            <w:r>
+              <w:rPr>
+                <w:rStyle w:val="Hyperlink"/>
+                <w:rFonts w:ascii="Sitka Text" w:eastAsia="Sitka Text" w:hAnsi="Sitka Text" w:cs="Sitka Text"/>
+                <w:noProof/>
+                <w:lang w:val="vi"/>
+              </w:rPr>
+              <w:t>-</w:t>
+            </w:r>
+            <w:r>
+              <w:rPr>
+                <w:rFonts w:asciiTheme="minorHAnsi" w:eastAsiaTheme="minorEastAsia" w:hAnsiTheme="minorHAnsi" w:cstheme="minorBidi"/>
+                <w:noProof/>
+                <w:kern w:val="2"/>
+                <w:sz w:val="24"/>
+                <w:szCs w:val="24"/>
+                <w:lang w:val="en-US"/>
+                <w14:ligatures w14:val="standardContextual"/>
+              </w:rPr>
+              <w:tab/>
+            </w:r>
+            <w:r>
+              <w:rPr>
+                <w:rStyle w:val="Hyperlink"/>
+                <w:noProof/>
+                <w:spacing w:val="-4"/>
+              </w:rPr>
+              <w:t xml:space="preserve">Use case </w:t>
+            </w:r>
+            <w:r>
+              <w:rPr>
+                <w:rStyle w:val="Hyperlink"/>
+                <w:noProof/>
+                <w:spacing w:val="-4"/>
+              </w:rPr>
+              <w:t>chi tiết (</w:t>
+            </w:r>
+            <w:r>
+              <w:rPr>
+                <w:rStyle w:val="Hyperlink"/>
+                <w:noProof/>
+                <w:spacing w:val="-4"/>
+              </w:rPr>
+              <w:t xml:space="preserve">Module: </w:t>
+            </w:r>
+            <w:r>
+              <w:rPr>
+                <w:rStyle w:val="Hyperlink"/>
+                <w:noProof/>
+                <w:spacing w:val="-4"/>
+              </w:rPr>
+              <w:t>)</w:t>
+            </w:r>
+            <w:r>
+              <w:rPr>
+                <w:rStyle w:val="Hyperlink"/>
+                <w:noProof/>
+                <w:spacing w:val="-4"/>
+              </w:rPr>
+              <w:t>:</w:t>
+            </w:r>
+            <w:r>
+              <w:rPr>
+                <w:noProof/>
+                <w:webHidden/>
+              </w:rPr>
+              <w:tab/>
+            </w:r>
+            <w:r>
+              <w:rPr>
+                <w:noProof/>
+                <w:webHidden/>
+              </w:rPr>
+              <w:fldChar w:fldCharType="begin"/>
+            </w:r>
+            <w:r>
+              <w:rPr>
+                <w:noProof/>
+                <w:webHidden/>
+              </w:rPr>
+              <w:instrText xml:space="preserve"> PAGEREF _Toc223971579 \h </w:instrText>
+            </w:r>
+            <w:r>
+              <w:rPr>
+                <w:noProof/>
+                <w:webHidden/>
+              </w:rPr>
+            </w:r>
+            <w:r>
+              <w:rPr>
+                <w:noProof/>
+                <w:webHidden/>
+              </w:rPr>
+              <w:fldChar w:fldCharType="separate"/>
+            </w:r>
+            <w:r>
+              <w:rPr>
+                <w:noProof/>
+                <w:webHidden/>
+              </w:rPr>
+              <w:t>21</w:t>
             </w:r>
             <w:r>
               <w:rPr>
@@ -4059,6 +4326,7 @@
                 <w:sz w:val="28"/>
                 <w:szCs w:val="28"/>
               </w:rPr>
+              <w:lastRenderedPageBreak/>
               <w:t>10</w:t>
             </w:r>
           </w:p>
@@ -4208,7 +4476,6 @@
                 <w:sz w:val="28"/>
                 <w:szCs w:val="28"/>
               </w:rPr>
-              <w:lastRenderedPageBreak/>
               <w:t>11</w:t>
             </w:r>
           </w:p>
@@ -6184,6 +6451,7 @@
                 <w:sz w:val="28"/>
                 <w:szCs w:val="28"/>
               </w:rPr>
+              <w:lastRenderedPageBreak/>
               <w:t>24</w:t>
             </w:r>
           </w:p>
@@ -6340,7 +6608,6 @@
                 <w:sz w:val="28"/>
                 <w:szCs w:val="28"/>
               </w:rPr>
-              <w:lastRenderedPageBreak/>
               <w:t>Các khái niệm liên quan đến vật</w:t>
             </w:r>
           </w:p>
@@ -8066,7 +8333,15 @@
                 <w:sz w:val="28"/>
                 <w:szCs w:val="28"/>
               </w:rPr>
-              <w:t>Phòng đã được dùng</w:t>
+              <w:t xml:space="preserve">Phòng đã được </w:t>
+            </w:r>
+            <w:r>
+              <w:rPr>
+                <w:sz w:val="28"/>
+                <w:szCs w:val="28"/>
+              </w:rPr>
+              <w:lastRenderedPageBreak/>
+              <w:t>dùng</w:t>
             </w:r>
           </w:p>
         </w:tc>
@@ -8101,7 +8376,16 @@
                 <w:sz w:val="28"/>
                 <w:szCs w:val="28"/>
               </w:rPr>
-              <w:t xml:space="preserve">Phòng đang trong quá trình sử dụng của khách </w:t>
+              <w:lastRenderedPageBreak/>
+              <w:t xml:space="preserve">Phòng đang trong quá trình sử dụng của </w:t>
+            </w:r>
+            <w:r>
+              <w:rPr>
+                <w:sz w:val="28"/>
+                <w:szCs w:val="28"/>
+              </w:rPr>
+              <w:lastRenderedPageBreak/>
+              <w:t xml:space="preserve">khách </w:t>
             </w:r>
             <w:r>
               <w:rPr>
@@ -8148,6 +8432,7 @@
                 <w:sz w:val="28"/>
                 <w:szCs w:val="28"/>
               </w:rPr>
+              <w:lastRenderedPageBreak/>
               <w:t>37</w:t>
             </w:r>
           </w:p>
@@ -8314,7 +8599,6 @@
                 <w:sz w:val="28"/>
                 <w:szCs w:val="28"/>
               </w:rPr>
-              <w:lastRenderedPageBreak/>
               <w:t>38</w:t>
             </w:r>
           </w:p>
@@ -9809,6 +10093,7 @@
                 <w:sz w:val="28"/>
                 <w:szCs w:val="28"/>
               </w:rPr>
+              <w:lastRenderedPageBreak/>
               <w:t>48</w:t>
             </w:r>
           </w:p>
@@ -10099,7 +10384,6 @@
                 <w:sz w:val="28"/>
                 <w:szCs w:val="28"/>
               </w:rPr>
-              <w:lastRenderedPageBreak/>
               <w:t>50</w:t>
             </w:r>
           </w:p>
@@ -11702,6 +11986,7 @@
                 <w:sz w:val="28"/>
                 <w:szCs w:val="28"/>
               </w:rPr>
+              <w:lastRenderedPageBreak/>
               <w:t>61</w:t>
             </w:r>
           </w:p>
@@ -12137,7 +12422,6 @@
                 <w:sz w:val="28"/>
                 <w:szCs w:val="28"/>
               </w:rPr>
-              <w:lastRenderedPageBreak/>
               <w:t>64</w:t>
             </w:r>
           </w:p>
@@ -13509,6 +13793,7 @@
                 <w:sz w:val="28"/>
                 <w:szCs w:val="28"/>
               </w:rPr>
+              <w:lastRenderedPageBreak/>
               <w:t>73</w:t>
             </w:r>
           </w:p>
@@ -13856,51 +14141,41 @@
                 <w:sz w:val="28"/>
                 <w:szCs w:val="28"/>
               </w:rPr>
-              <w:t xml:space="preserve">Room Availability </w:t>
-            </w:r>
+              <w:t>Room Availability Check</w:t>
+            </w:r>
+          </w:p>
+        </w:tc>
+        <w:tc>
+          <w:tcPr>
+            <w:tcW w:w="2277" w:type="dxa"/>
+            <w:tcBorders>
+              <w:top w:val="single" w:sz="8" w:space="0" w:color="000000"/>
+              <w:left w:val="single" w:sz="8" w:space="0" w:color="000000"/>
+              <w:bottom w:val="single" w:sz="8" w:space="0" w:color="000000"/>
+              <w:right w:val="single" w:sz="8" w:space="0" w:color="000000"/>
+            </w:tcBorders>
+            <w:tcMar>
+              <w:top w:w="100" w:type="dxa"/>
+              <w:left w:w="100" w:type="dxa"/>
+              <w:bottom w:w="100" w:type="dxa"/>
+              <w:right w:w="100" w:type="dxa"/>
+            </w:tcMar>
+          </w:tcPr>
+          <w:p>
+            <w:pPr>
+              <w:pStyle w:val="TableParagraph"/>
+              <w:jc w:val="center"/>
+              <w:rPr>
+                <w:sz w:val="28"/>
+                <w:szCs w:val="28"/>
+              </w:rPr>
+            </w:pPr>
             <w:r>
               <w:rPr>
                 <w:color w:val="000000"/>
                 <w:sz w:val="28"/>
                 <w:szCs w:val="28"/>
               </w:rPr>
-              <w:lastRenderedPageBreak/>
-              <w:t>Check</w:t>
-            </w:r>
-          </w:p>
-        </w:tc>
-        <w:tc>
-          <w:tcPr>
-            <w:tcW w:w="2277" w:type="dxa"/>
-            <w:tcBorders>
-              <w:top w:val="single" w:sz="8" w:space="0" w:color="000000"/>
-              <w:left w:val="single" w:sz="8" w:space="0" w:color="000000"/>
-              <w:bottom w:val="single" w:sz="8" w:space="0" w:color="000000"/>
-              <w:right w:val="single" w:sz="8" w:space="0" w:color="000000"/>
-            </w:tcBorders>
-            <w:tcMar>
-              <w:top w:w="100" w:type="dxa"/>
-              <w:left w:w="100" w:type="dxa"/>
-              <w:bottom w:w="100" w:type="dxa"/>
-              <w:right w:w="100" w:type="dxa"/>
-            </w:tcMar>
-          </w:tcPr>
-          <w:p>
-            <w:pPr>
-              <w:pStyle w:val="TableParagraph"/>
-              <w:jc w:val="center"/>
-              <w:rPr>
-                <w:sz w:val="28"/>
-                <w:szCs w:val="28"/>
-              </w:rPr>
-            </w:pPr>
-            <w:r>
-              <w:rPr>
-                <w:color w:val="000000"/>
-                <w:sz w:val="28"/>
-                <w:szCs w:val="28"/>
-              </w:rPr>
-              <w:lastRenderedPageBreak/>
               <w:t>Kiểm tra phòng trống</w:t>
             </w:r>
           </w:p>
@@ -15679,6 +15954,7 @@
                 <w:sz w:val="28"/>
                 <w:szCs w:val="28"/>
               </w:rPr>
+              <w:lastRenderedPageBreak/>
               <w:t>87</w:t>
             </w:r>
           </w:p>
@@ -16087,15 +16363,7 @@
                 <w:sz w:val="28"/>
                 <w:szCs w:val="28"/>
               </w:rPr>
-              <w:t xml:space="preserve">Hệ thống tính tiền lương dựa trên tổng giờ làm, mức lương cứng cơ bản, lương </w:t>
-            </w:r>
-            <w:r>
-              <w:rPr>
-                <w:sz w:val="28"/>
-                <w:szCs w:val="28"/>
-              </w:rPr>
-              <w:lastRenderedPageBreak/>
-              <w:t>theo giờ và tổng tiền bị phạt của nhân viên.</w:t>
+              <w:t>Hệ thống tính tiền lương dựa trên tổng giờ làm, mức lương cứng cơ bản, lương theo giờ và tổng tiền bị phạt của nhân viên.</w:t>
             </w:r>
           </w:p>
         </w:tc>
@@ -16134,7 +16402,6 @@
                 <w:sz w:val="28"/>
                 <w:szCs w:val="28"/>
               </w:rPr>
-              <w:lastRenderedPageBreak/>
               <w:t>90</w:t>
             </w:r>
           </w:p>
@@ -17823,6 +18090,7 @@
                 <w:sz w:val="28"/>
                 <w:szCs w:val="28"/>
               </w:rPr>
+              <w:lastRenderedPageBreak/>
               <w:t>101</w:t>
             </w:r>
           </w:p>
@@ -18171,7 +18439,6 @@
                 <w:sz w:val="28"/>
                 <w:szCs w:val="28"/>
               </w:rPr>
-              <w:lastRenderedPageBreak/>
               <w:t>103</w:t>
             </w:r>
           </w:p>
@@ -19621,7 +19888,16 @@
                 <w:sz w:val="28"/>
                 <w:szCs w:val="28"/>
               </w:rPr>
-              <w:t>Thời lượng sử dụng</w:t>
+              <w:t xml:space="preserve">Thời lượng sử </w:t>
+            </w:r>
+            <w:r>
+              <w:rPr>
+                <w:color w:val="1F1F1F"/>
+                <w:sz w:val="28"/>
+                <w:szCs w:val="28"/>
+              </w:rPr>
+              <w:lastRenderedPageBreak/>
+              <w:t>dụng</w:t>
             </w:r>
           </w:p>
         </w:tc>
@@ -19657,6 +19933,7 @@
                 <w:sz w:val="28"/>
                 <w:szCs w:val="28"/>
               </w:rPr>
+              <w:lastRenderedPageBreak/>
               <w:t xml:space="preserve">Tổng thời gian khách dùng </w:t>
             </w:r>
             <w:r>
@@ -20197,7 +20474,6 @@
                 <w:sz w:val="28"/>
                 <w:szCs w:val="28"/>
               </w:rPr>
-              <w:lastRenderedPageBreak/>
               <w:t>116</w:t>
             </w:r>
           </w:p>
@@ -21026,7 +21302,35 @@
           <w:b w:val="0"/>
           <w:bCs w:val="0"/>
         </w:rPr>
-        <w:t>Karaoke, được sử dụng bên trong nội bộ của nhà hàng.</w:t>
+        <w:t xml:space="preserve">Karaoke, được sử dụng bên trong nội bộ </w:t>
+      </w:r>
+      <w:r>
+        <w:rPr>
+          <w:b w:val="0"/>
+          <w:bCs w:val="0"/>
+        </w:rPr>
+        <w:t>của 1</w:t>
+      </w:r>
+      <w:r>
+        <w:rPr>
+          <w:b w:val="0"/>
+          <w:bCs w:val="0"/>
+        </w:rPr>
+        <w:t xml:space="preserve"> nhà hàng</w:t>
+      </w:r>
+      <w:r>
+        <w:rPr>
+          <w:b w:val="0"/>
+          <w:bCs w:val="0"/>
+        </w:rPr>
+        <w:t xml:space="preserve"> với 1 chủ sở hữu</w:t>
+      </w:r>
+      <w:r>
+        <w:rPr>
+          <w:b w:val="0"/>
+          <w:bCs w:val="0"/>
+        </w:rPr>
+        <w:t>.</w:t>
       </w:r>
       <w:r>
         <w:rPr>
@@ -21754,6 +22058,7 @@
           <w:sz w:val="24"/>
           <w:szCs w:val="24"/>
         </w:rPr>
+        <w:lastRenderedPageBreak/>
         <w:t>Bộ lọc theo loại phòng, kích cỡ phòng</w:t>
       </w:r>
       <w:bookmarkEnd w:id="27"/>
@@ -21781,7 +22086,6 @@
           <w:sz w:val="24"/>
           <w:szCs w:val="24"/>
         </w:rPr>
-        <w:lastRenderedPageBreak/>
         <w:t>Nút tìm kiếm phòng</w:t>
       </w:r>
       <w:r>
@@ -21861,7 +22165,57 @@
           <w:sz w:val="24"/>
           <w:szCs w:val="24"/>
         </w:rPr>
-        <w:t>).</w:t>
+        <w:t>)</w:t>
+      </w:r>
+      <w:r>
+        <w:rPr>
+          <w:b w:val="0"/>
+          <w:bCs w:val="0"/>
+          <w:spacing w:val="-4"/>
+          <w:sz w:val="24"/>
+          <w:szCs w:val="24"/>
+        </w:rPr>
+        <w:t xml:space="preserve">, </w:t>
+      </w:r>
+      <w:r>
+        <w:rPr>
+          <w:b w:val="0"/>
+          <w:bCs w:val="0"/>
+          <w:spacing w:val="-4"/>
+          <w:sz w:val="24"/>
+          <w:szCs w:val="24"/>
+        </w:rPr>
+        <w:t>với mỗi dòng tương ứng</w:t>
+      </w:r>
+      <w:r>
+        <w:rPr>
+          <w:b w:val="0"/>
+          <w:bCs w:val="0"/>
+          <w:spacing w:val="-4"/>
+          <w:sz w:val="24"/>
+          <w:szCs w:val="24"/>
+        </w:rPr>
+        <w:t xml:space="preserve"> các thông tin: Tên phòng, Kích cỡ, Loại phòng, Giá phòng theo </w:t>
+      </w:r>
+      <w:r>
+        <w:rPr>
+          <w:b w:val="0"/>
+          <w:bCs w:val="0"/>
+          <w:spacing w:val="-4"/>
+          <w:sz w:val="24"/>
+          <w:szCs w:val="24"/>
+        </w:rPr>
+        <w:t>giờ, Trạng thái phòng</w:t>
+      </w:r>
+      <w:r>
+        <w:rPr>
+          <w:b w:val="0"/>
+          <w:bCs w:val="0"/>
+          <w:spacing w:val="-4"/>
+          <w:sz w:val="24"/>
+          <w:szCs w:val="24"/>
+        </w:rPr>
+        <w:t>.</w:t>
       </w:r>
       <w:bookmarkEnd w:id="29"/>
     </w:p>
@@ -22570,7 +22924,27 @@
           <w:sz w:val="24"/>
           <w:szCs w:val="24"/>
         </w:rPr>
-        <w:t xml:space="preserve"> trong ca làm việc hiện tại và đang rảnh rỗi.</w:t>
+        <w:t xml:space="preserve"> trong ca làm việc hiện tại và đang rảnh rỗi</w:t>
+      </w:r>
+      <w:r>
+        <w:rPr>
+          <w:b w:val="0"/>
+          <w:bCs w:val="0"/>
+          <w:spacing w:val="-4"/>
+          <w:sz w:val="24"/>
+          <w:szCs w:val="24"/>
+        </w:rPr>
+        <w:t xml:space="preserve"> ( với mỗi dòng tương ứng với các thông tin: Tên nhân viên, Số điện thoại, Số giờ trực trong ngày, Trạng thái làm việc)</w:t>
+      </w:r>
+      <w:r>
+        <w:rPr>
+          <w:b w:val="0"/>
+          <w:bCs w:val="0"/>
+          <w:spacing w:val="-4"/>
+          <w:sz w:val="24"/>
+          <w:szCs w:val="24"/>
+        </w:rPr>
+        <w:t>.</w:t>
       </w:r>
       <w:bookmarkEnd w:id="36"/>
     </w:p>
@@ -22624,9 +22998,19 @@
           <w:sz w:val="24"/>
           <w:szCs w:val="24"/>
         </w:rPr>
-        <w:t>Ô nhập tên nhân viên và nút tìm kiếm</w:t>
+        <w:t xml:space="preserve">Ô nhập tên nhân viên và nút tìm </w:t>
       </w:r>
       <w:bookmarkEnd w:id="38"/>
+      <w:r>
+        <w:rPr>
+          <w:b w:val="0"/>
+          <w:bCs w:val="0"/>
+          <w:spacing w:val="-4"/>
+          <w:sz w:val="24"/>
+          <w:szCs w:val="24"/>
+        </w:rPr>
+        <w:t>kiếm.</w:t>
+      </w:r>
     </w:p>
     <w:p>
       <w:pPr>
@@ -23088,6 +23472,7 @@
           <w:sz w:val="24"/>
           <w:szCs w:val="24"/>
         </w:rPr>
+        <w:lastRenderedPageBreak/>
         <w:t xml:space="preserve">Nếu khách hàng không đồng ý </w:t>
       </w:r>
       <w:r>
@@ -23270,8 +23655,7 @@
           <w:sz w:val="24"/>
           <w:szCs w:val="24"/>
         </w:rPr>
-        <w:lastRenderedPageBreak/>
-        <w:t>Các nút tìm kiếm, thêm mới.</w:t>
+        <w:t>Nút tìm kiếm (theo tên / số điện thoại) , nút thêm mới.</w:t>
       </w:r>
       <w:bookmarkEnd w:id="48"/>
     </w:p>
@@ -23304,31 +23688,23 @@
           <w:bCs w:val="0"/>
           <w:spacing w:val="-4"/>
         </w:rPr>
-        <w:t xml:space="preserve"> hỏi </w:t>
-      </w:r>
-      <w:r>
-        <w:rPr>
-          <w:b w:val="0"/>
-          <w:bCs w:val="0"/>
-          <w:spacing w:val="-4"/>
-        </w:rPr>
-        <w:t xml:space="preserve">các thông tin của khách hàng </w:t>
-      </w:r>
-      <w:r>
-        <w:rPr>
-          <w:b w:val="0"/>
-          <w:bCs w:val="0"/>
-          <w:spacing w:val="-4"/>
-        </w:rPr>
-        <w:t>→</w:t>
-      </w:r>
-      <w:r>
-        <w:rPr>
-          <w:b w:val="0"/>
-          <w:bCs w:val="0"/>
-          <w:spacing w:val="-4"/>
-        </w:rPr>
-        <w:t xml:space="preserve"> Khách hàng cung cấp thông tin cho </w:t>
+        <w:t xml:space="preserve"> hỏi các thông tin của khách hàng</w:t>
+      </w:r>
+      <w:r>
+        <w:rPr>
+          <w:b w:val="0"/>
+          <w:bCs w:val="0"/>
+          <w:spacing w:val="-4"/>
+        </w:rPr>
+        <w:t xml:space="preserve"> (Tên, Địa chỉ, Số điện thoại, Email, Ghi chú)</w:t>
+      </w:r>
+      <w:r>
+        <w:rPr>
+          <w:b w:val="0"/>
+          <w:bCs w:val="0"/>
+          <w:spacing w:val="-4"/>
+        </w:rPr>
+        <w:t xml:space="preserve"> → Khách hàng cung cấp thông tin cho </w:t>
       </w:r>
       <w:r>
         <w:rPr>
@@ -23344,6 +23720,30 @@
           <w:bCs w:val="0"/>
           <w:spacing w:val="-4"/>
         </w:rPr>
+        <w:t xml:space="preserve"> → </w:t>
+      </w:r>
+      <w:r>
+        <w:rPr>
+          <w:b w:val="0"/>
+          <w:bCs w:val="0"/>
+          <w:spacing w:val="-4"/>
+        </w:rPr>
+        <w:t>Lễ tân</w:t>
+      </w:r>
+      <w:r>
+        <w:rPr>
+          <w:b w:val="0"/>
+          <w:bCs w:val="0"/>
+          <w:spacing w:val="-4"/>
+        </w:rPr>
+        <w:t xml:space="preserve"> nhập</w:t>
+      </w:r>
+      <w:r>
+        <w:rPr>
+          <w:b w:val="0"/>
+          <w:bCs w:val="0"/>
+          <w:spacing w:val="-4"/>
+        </w:rPr>
         <w:t xml:space="preserve"> </w:t>
       </w:r>
       <w:r>
@@ -23352,31 +23752,39 @@
           <w:bCs w:val="0"/>
           <w:spacing w:val="-4"/>
         </w:rPr>
-        <w:t>→</w:t>
-      </w:r>
-      <w:r>
-        <w:rPr>
-          <w:b w:val="0"/>
-          <w:bCs w:val="0"/>
-          <w:spacing w:val="-4"/>
-        </w:rPr>
-        <w:t xml:space="preserve"> </w:t>
-      </w:r>
-      <w:r>
-        <w:rPr>
-          <w:b w:val="0"/>
-          <w:bCs w:val="0"/>
-          <w:spacing w:val="-4"/>
-        </w:rPr>
-        <w:t>Lễ tân</w:t>
-      </w:r>
-      <w:r>
-        <w:rPr>
-          <w:b w:val="0"/>
-          <w:bCs w:val="0"/>
-          <w:spacing w:val="-4"/>
-        </w:rPr>
-        <w:t xml:space="preserve"> nhập đầy đủ thông tin và ấn nút tìm:</w:t>
+        <w:t>thông tin</w:t>
+      </w:r>
+      <w:r>
+        <w:rPr>
+          <w:b w:val="0"/>
+          <w:bCs w:val="0"/>
+          <w:spacing w:val="-4"/>
+        </w:rPr>
+        <w:t xml:space="preserve"> (</w:t>
+      </w:r>
+      <w:r>
+        <w:rPr>
+          <w:b w:val="0"/>
+          <w:bCs w:val="0"/>
+          <w:spacing w:val="-4"/>
+        </w:rPr>
+        <w:t>t</w:t>
+      </w:r>
+      <w:r>
+        <w:rPr>
+          <w:b w:val="0"/>
+          <w:bCs w:val="0"/>
+          <w:spacing w:val="-4"/>
+        </w:rPr>
+        <w:t>ên / số điện thoại)</w:t>
+      </w:r>
+      <w:r>
+        <w:rPr>
+          <w:b w:val="0"/>
+          <w:bCs w:val="0"/>
+          <w:spacing w:val="-4"/>
+        </w:rPr>
+        <w:t xml:space="preserve"> và ấn nút tìm:</w:t>
       </w:r>
       <w:bookmarkEnd w:id="49"/>
     </w:p>
@@ -23403,7 +23811,7 @@
           <w:sz w:val="24"/>
           <w:szCs w:val="24"/>
         </w:rPr>
-        <w:t xml:space="preserve">Nếu thông tin khách hàng không có trong kết quả tìm kiếm </w:t>
+        <w:t xml:space="preserve">Nếu thông tin khách hàng không có trong kết quả tìm kiếm → Hệ thống báo không có khách hàng → </w:t>
       </w:r>
       <w:r>
         <w:rPr>
@@ -23413,7 +23821,7 @@
           <w:sz w:val="24"/>
           <w:szCs w:val="24"/>
         </w:rPr>
-        <w:t>→</w:t>
+        <w:t>Lễ tân</w:t>
       </w:r>
       <w:r>
         <w:rPr>
@@ -23423,67 +23831,7 @@
           <w:sz w:val="24"/>
           <w:szCs w:val="24"/>
         </w:rPr>
-        <w:t xml:space="preserve"> Hệ thống báo không có khách hàng </w:t>
-      </w:r>
-      <w:r>
-        <w:rPr>
-          <w:b w:val="0"/>
-          <w:bCs w:val="0"/>
-          <w:spacing w:val="-4"/>
-          <w:sz w:val="24"/>
-          <w:szCs w:val="24"/>
-        </w:rPr>
-        <w:t>→</w:t>
-      </w:r>
-      <w:r>
-        <w:rPr>
-          <w:b w:val="0"/>
-          <w:bCs w:val="0"/>
-          <w:spacing w:val="-4"/>
-          <w:sz w:val="24"/>
-          <w:szCs w:val="24"/>
-        </w:rPr>
-        <w:t xml:space="preserve"> </w:t>
-      </w:r>
-      <w:r>
-        <w:rPr>
-          <w:b w:val="0"/>
-          <w:bCs w:val="0"/>
-          <w:spacing w:val="-4"/>
-          <w:sz w:val="24"/>
-          <w:szCs w:val="24"/>
-        </w:rPr>
-        <w:t>Lễ tân</w:t>
-      </w:r>
-      <w:r>
-        <w:rPr>
-          <w:b w:val="0"/>
-          <w:bCs w:val="0"/>
-          <w:spacing w:val="-4"/>
-          <w:sz w:val="24"/>
-          <w:szCs w:val="24"/>
-        </w:rPr>
-        <w:t xml:space="preserve"> chọn thêm mới </w:t>
-      </w:r>
-      <w:r>
-        <w:rPr>
-          <w:b w:val="0"/>
-          <w:bCs w:val="0"/>
-          <w:spacing w:val="-4"/>
-          <w:sz w:val="24"/>
-          <w:szCs w:val="24"/>
-        </w:rPr>
-        <w:t>→</w:t>
-      </w:r>
-      <w:r>
-        <w:rPr>
-          <w:b w:val="0"/>
-          <w:bCs w:val="0"/>
-          <w:spacing w:val="-4"/>
-          <w:sz w:val="24"/>
-          <w:szCs w:val="24"/>
-        </w:rPr>
-        <w:t xml:space="preserve"> Hệ thống thêm thông tin khách hàng và xuất hiện thông báo Xác nhận.</w:t>
+        <w:t xml:space="preserve"> chọn thêm mới → Hệ thống thêm thông tin khách hàng và xuất hiện thông báo Xác nhận.</w:t>
       </w:r>
       <w:bookmarkEnd w:id="50"/>
     </w:p>
@@ -23510,7 +23858,7 @@
           <w:sz w:val="24"/>
           <w:szCs w:val="24"/>
         </w:rPr>
-        <w:t xml:space="preserve">Nếu thông tin khách hàng có trong kết quả tìm kiếm </w:t>
+        <w:t xml:space="preserve">Nếu thông tin khách hàng có trong kết quả tìm kiếm → Hệ thống hiện danh sách khách hàng có tên chứa từ khóa cần tìm (với mỗi dòng tương ứng với các thông tin sau: Tên, Địa chỉ, Số điện thoại, Email, Ghi chú) → </w:t>
       </w:r>
       <w:r>
         <w:rPr>
@@ -23520,7 +23868,7 @@
           <w:sz w:val="24"/>
           <w:szCs w:val="24"/>
         </w:rPr>
-        <w:t>→</w:t>
+        <w:t>Lễ tân</w:t>
       </w:r>
       <w:r>
         <w:rPr>
@@ -23530,67 +23878,7 @@
           <w:sz w:val="24"/>
           <w:szCs w:val="24"/>
         </w:rPr>
-        <w:t xml:space="preserve"> Hệ thống hiện danh sách khách hàng có tên chứa từ khóa cần tìm (với mỗi dòng tương ứng với các thông tin sau: Tên, Địa chỉ, Số điện thoại, Email, Ghi chú) </w:t>
-      </w:r>
-      <w:r>
-        <w:rPr>
-          <w:b w:val="0"/>
-          <w:bCs w:val="0"/>
-          <w:spacing w:val="-4"/>
-          <w:sz w:val="24"/>
-          <w:szCs w:val="24"/>
-        </w:rPr>
-        <w:t>→</w:t>
-      </w:r>
-      <w:r>
-        <w:rPr>
-          <w:b w:val="0"/>
-          <w:bCs w:val="0"/>
-          <w:spacing w:val="-4"/>
-          <w:sz w:val="24"/>
-          <w:szCs w:val="24"/>
-        </w:rPr>
-        <w:t xml:space="preserve"> </w:t>
-      </w:r>
-      <w:r>
-        <w:rPr>
-          <w:b w:val="0"/>
-          <w:bCs w:val="0"/>
-          <w:spacing w:val="-4"/>
-          <w:sz w:val="24"/>
-          <w:szCs w:val="24"/>
-        </w:rPr>
-        <w:t>Lễ tân</w:t>
-      </w:r>
-      <w:r>
-        <w:rPr>
-          <w:b w:val="0"/>
-          <w:bCs w:val="0"/>
-          <w:spacing w:val="-4"/>
-          <w:sz w:val="24"/>
-          <w:szCs w:val="24"/>
-        </w:rPr>
-        <w:t xml:space="preserve"> ấn chọn vào đúng dòng của khách hàng </w:t>
-      </w:r>
-      <w:r>
-        <w:rPr>
-          <w:b w:val="0"/>
-          <w:bCs w:val="0"/>
-          <w:spacing w:val="-4"/>
-          <w:sz w:val="24"/>
-          <w:szCs w:val="24"/>
-        </w:rPr>
-        <w:t>→</w:t>
-      </w:r>
-      <w:r>
-        <w:rPr>
-          <w:b w:val="0"/>
-          <w:bCs w:val="0"/>
-          <w:spacing w:val="-4"/>
-          <w:sz w:val="24"/>
-          <w:szCs w:val="24"/>
-        </w:rPr>
-        <w:t xml:space="preserve"> Hệ thống chuyển qua giao diện Xác nhận Đơn đặt phòng.</w:t>
+        <w:t xml:space="preserve"> ấn chọn vào đúng dòng của khách hàng → Hệ thống chuyển qua giao diện Xác nhận Đơn đặt phòng.</w:t>
       </w:r>
       <w:bookmarkEnd w:id="51"/>
     </w:p>
@@ -23633,7 +23921,6 @@
           <w:u w:val="single"/>
         </w:rPr>
       </w:pPr>
-      <w:bookmarkStart w:id="53" w:name="_Toc223433041"/>
       <w:r>
         <w:rPr>
           <w:b w:val="0"/>
@@ -23642,9 +23929,48 @@
           <w:sz w:val="24"/>
           <w:szCs w:val="24"/>
         </w:rPr>
-        <w:t>Thông tin của khách hàng (Tên, Địa chỉ, Số điện thoại, Email, Ghi chú).</w:t>
-      </w:r>
-      <w:bookmarkEnd w:id="53"/>
+        <w:t>Thông tin của nhân viên tạo đơn (</w:t>
+      </w:r>
+      <w:r>
+        <w:rPr>
+          <w:b w:val="0"/>
+          <w:bCs w:val="0"/>
+          <w:spacing w:val="-4"/>
+          <w:sz w:val="24"/>
+          <w:szCs w:val="24"/>
+        </w:rPr>
+        <w:t xml:space="preserve">Mã nhân viên, </w:t>
+      </w:r>
+      <w:r>
+        <w:rPr>
+          <w:b w:val="0"/>
+          <w:bCs w:val="0"/>
+          <w:spacing w:val="-4"/>
+          <w:sz w:val="24"/>
+          <w:szCs w:val="24"/>
+        </w:rPr>
+        <w:t>Tên</w:t>
+      </w:r>
+      <w:r>
+        <w:rPr>
+          <w:b w:val="0"/>
+          <w:bCs w:val="0"/>
+          <w:spacing w:val="-4"/>
+          <w:sz w:val="24"/>
+          <w:szCs w:val="24"/>
+        </w:rPr>
+        <w:t xml:space="preserve"> nhân viên, Chức vụ</w:t>
+      </w:r>
+      <w:r>
+        <w:rPr>
+          <w:b w:val="0"/>
+          <w:bCs w:val="0"/>
+          <w:spacing w:val="-4"/>
+          <w:sz w:val="24"/>
+          <w:szCs w:val="24"/>
+        </w:rPr>
+        <w:t>).</w:t>
+      </w:r>
     </w:p>
     <w:p>
       <w:pPr>
@@ -23660,7 +23986,7 @@
           <w:u w:val="single"/>
         </w:rPr>
       </w:pPr>
-      <w:bookmarkStart w:id="54" w:name="_Toc223433042"/>
+      <w:bookmarkStart w:id="53" w:name="_Toc223433041"/>
       <w:r>
         <w:rPr>
           <w:b w:val="0"/>
@@ -23669,9 +23995,9 @@
           <w:sz w:val="24"/>
           <w:szCs w:val="24"/>
         </w:rPr>
-        <w:t>Thông tin phòng hát được đặt (Tên phòng, Kích cỡ, Loại phòng, Giá phòng theo giờ).</w:t>
-      </w:r>
-      <w:bookmarkEnd w:id="54"/>
+        <w:t>Thông tin của khách hàng (Tên, Địa chỉ, Số điện thoại, Email, Ghi chú).</w:t>
+      </w:r>
+      <w:bookmarkEnd w:id="53"/>
     </w:p>
     <w:p>
       <w:pPr>
@@ -23687,7 +24013,7 @@
           <w:u w:val="single"/>
         </w:rPr>
       </w:pPr>
-      <w:bookmarkStart w:id="55" w:name="_Toc223433043"/>
+      <w:bookmarkStart w:id="54" w:name="_Toc223433042"/>
       <w:r>
         <w:rPr>
           <w:b w:val="0"/>
@@ -23696,9 +24022,9 @@
           <w:sz w:val="24"/>
           <w:szCs w:val="24"/>
         </w:rPr>
-        <w:t>Thời gian đặt phòng.</w:t>
-      </w:r>
-      <w:bookmarkEnd w:id="55"/>
+        <w:t>Thông tin phòng hát được đặt (Tên phòng, Kích cỡ, Loại phòng, Giá phòng theo giờ).</w:t>
+      </w:r>
+      <w:bookmarkEnd w:id="54"/>
     </w:p>
     <w:p>
       <w:pPr>
@@ -23714,6 +24040,33 @@
           <w:u w:val="single"/>
         </w:rPr>
       </w:pPr>
+      <w:bookmarkStart w:id="55" w:name="_Toc223433043"/>
+      <w:r>
+        <w:rPr>
+          <w:b w:val="0"/>
+          <w:bCs w:val="0"/>
+          <w:spacing w:val="-4"/>
+          <w:sz w:val="24"/>
+          <w:szCs w:val="24"/>
+        </w:rPr>
+        <w:t>Thời gian đặt phòng.</w:t>
+      </w:r>
+      <w:bookmarkEnd w:id="55"/>
+    </w:p>
+    <w:p>
+      <w:pPr>
+        <w:pStyle w:val="Heading3"/>
+        <w:numPr>
+          <w:ilvl w:val="4"/>
+          <w:numId w:val="4"/>
+        </w:numPr>
+        <w:spacing w:before="184"/>
+        <w:ind w:left="2127" w:hanging="426"/>
+        <w:rPr>
+          <w:spacing w:val="-4"/>
+          <w:u w:val="single"/>
+        </w:rPr>
+      </w:pPr>
       <w:bookmarkStart w:id="56" w:name="_Toc223433044"/>
       <w:r>
         <w:rPr>
@@ -23756,7 +24109,55 @@
           <w:bCs w:val="0"/>
           <w:spacing w:val="-4"/>
         </w:rPr>
-        <w:t xml:space="preserve"> đọc lại đầy đủ thông tin đặt phòng hát cho khách hàng và yêu cầu xác nhận </w:t>
+        <w:t xml:space="preserve"> đọc lại đầy đủ thông tin đặt phòng hát</w:t>
+      </w:r>
+      <w:r>
+        <w:rPr>
+          <w:b w:val="0"/>
+          <w:bCs w:val="0"/>
+          <w:spacing w:val="-4"/>
+        </w:rPr>
+        <w:t xml:space="preserve"> (Thông tin của nhân viên</w:t>
+      </w:r>
+      <w:r>
+        <w:rPr>
+          <w:b w:val="0"/>
+          <w:bCs w:val="0"/>
+          <w:spacing w:val="-4"/>
+        </w:rPr>
+        <w:t xml:space="preserve"> </w:t>
+      </w:r>
+      <w:r>
+        <w:rPr>
+          <w:b w:val="0"/>
+          <w:bCs w:val="0"/>
+          <w:spacing w:val="-4"/>
+        </w:rPr>
+        <w:t>tạo đơn (</w:t>
+      </w:r>
+      <w:r>
+        <w:rPr>
+          <w:b w:val="0"/>
+          <w:bCs w:val="0"/>
+          <w:spacing w:val="-4"/>
+        </w:rPr>
+        <w:t>Mã nhân viên, Tên nhân viên, Chức vụ</w:t>
+      </w:r>
+      <w:r>
+        <w:rPr>
+          <w:b w:val="0"/>
+          <w:bCs w:val="0"/>
+          <w:spacing w:val="-4"/>
+        </w:rPr>
+        <w:t>). Thông tin của khách hàng: Tên, Địa chỉ, Số điện thoại, Email, Ghi chú. Thông tin phòng hát được đặt: Tên phòng, Kích cỡ, Loại phòng, Giá phòng theo giờ. Thời gian đặt phòng. Các ghi chú khác)</w:t>
+      </w:r>
+      <w:r>
+        <w:rPr>
+          <w:b w:val="0"/>
+          <w:bCs w:val="0"/>
+          <w:spacing w:val="-4"/>
+        </w:rPr>
+        <w:t xml:space="preserve"> cho khách hàng và yêu cầu xác nhận </w:t>
       </w:r>
       <w:r>
         <w:rPr>
@@ -23940,7 +24341,16 @@
           <w:bCs w:val="0"/>
           <w:spacing w:val="-4"/>
         </w:rPr>
-        <w:t xml:space="preserve"> Hệ thống chuyển sang giao diện danh sách các phòng hát đang được đặt (với mỗi dòng tương ứng với các thông tin: Tên phòng, Kích cỡ, Loại phòng, Giá phòng theo giờ)</w:t>
+        <w:t xml:space="preserve"> Hệ thống chuyển sang giao diện danh sách các phòng hát đang được đặt (với mỗi dòng tương ứng với các thông tin: Tên </w:t>
+      </w:r>
+      <w:r>
+        <w:rPr>
+          <w:b w:val="0"/>
+          <w:bCs w:val="0"/>
+          <w:spacing w:val="-4"/>
+        </w:rPr>
+        <w:lastRenderedPageBreak/>
+        <w:t>phòng, Kích cỡ, Loại phòng, Giá phòng theo giờ)</w:t>
       </w:r>
       <w:r>
         <w:rPr>
@@ -24275,16 +24685,7 @@
           <w:bCs w:val="0"/>
           <w:spacing w:val="-4"/>
         </w:rPr>
-        <w:t xml:space="preserve"> lại quá trình: Tìm kiếm </w:t>
-      </w:r>
-      <w:r>
-        <w:rPr>
-          <w:b w:val="0"/>
-          <w:bCs w:val="0"/>
-          <w:spacing w:val="-4"/>
-        </w:rPr>
-        <w:lastRenderedPageBreak/>
-        <w:t xml:space="preserve">mặt hàng theo tên </w:t>
+        <w:t xml:space="preserve"> lại quá trình: Tìm kiếm mặt hàng theo tên </w:t>
       </w:r>
       <w:r>
         <w:rPr>
@@ -24413,7 +24814,15 @@
           <w:bCs w:val="0"/>
           <w:spacing w:val="-4"/>
         </w:rPr>
-        <w:t xml:space="preserve"> đọc lại hóa đơn cho khách hàng </w:t>
+        <w:t xml:space="preserve"> đọc lại hóa đơn cho khách hàng</w:t>
+      </w:r>
+      <w:r>
+        <w:rPr>
+          <w:b w:val="0"/>
+          <w:bCs w:val="0"/>
+          <w:spacing w:val="-4"/>
+        </w:rPr>
+        <w:t xml:space="preserve"> </w:t>
       </w:r>
       <w:r>
         <w:rPr>
@@ -24564,8 +24973,280 @@
     <w:p>
       <w:pPr>
         <w:pStyle w:val="Heading3"/>
+        <w:numPr>
+          <w:ilvl w:val="3"/>
+          <w:numId w:val="4"/>
+        </w:numPr>
         <w:spacing w:before="184"/>
         <w:ind w:left="1418"/>
+        <w:rPr>
+          <w:spacing w:val="-4"/>
+          <w:u w:val="single"/>
+        </w:rPr>
+      </w:pPr>
+      <w:r>
+        <w:rPr>
+          <w:b w:val="0"/>
+          <w:bCs w:val="0"/>
+          <w:spacing w:val="-4"/>
+        </w:rPr>
+        <w:t xml:space="preserve">Với thông tin của hóa đơn bao gồm: </w:t>
+      </w:r>
+    </w:p>
+    <w:p>
+      <w:pPr>
+        <w:pStyle w:val="Heading3"/>
+        <w:numPr>
+          <w:ilvl w:val="4"/>
+          <w:numId w:val="4"/>
+        </w:numPr>
+        <w:spacing w:before="184"/>
+        <w:ind w:left="2127" w:hanging="426"/>
+        <w:rPr>
+          <w:spacing w:val="-4"/>
+          <w:u w:val="single"/>
+        </w:rPr>
+      </w:pPr>
+      <w:r>
+        <w:rPr>
+          <w:b w:val="0"/>
+          <w:bCs w:val="0"/>
+          <w:spacing w:val="-4"/>
+          <w:sz w:val="24"/>
+          <w:szCs w:val="24"/>
+        </w:rPr>
+        <w:t>Mã hóa đơn.</w:t>
+      </w:r>
+    </w:p>
+    <w:p>
+      <w:pPr>
+        <w:pStyle w:val="Heading3"/>
+        <w:numPr>
+          <w:ilvl w:val="4"/>
+          <w:numId w:val="4"/>
+        </w:numPr>
+        <w:spacing w:before="184"/>
+        <w:ind w:left="2127" w:hanging="426"/>
+        <w:rPr>
+          <w:spacing w:val="-4"/>
+          <w:u w:val="single"/>
+        </w:rPr>
+      </w:pPr>
+      <w:r>
+        <w:rPr>
+          <w:b w:val="0"/>
+          <w:bCs w:val="0"/>
+          <w:spacing w:val="-4"/>
+          <w:sz w:val="24"/>
+          <w:szCs w:val="24"/>
+        </w:rPr>
+        <w:t>Thông tin nhân viên tạo hóa đơn: Mã nhân viên, Tên nhân viên, Chức vụ.</w:t>
+      </w:r>
+    </w:p>
+    <w:p>
+      <w:pPr>
+        <w:pStyle w:val="Heading3"/>
+        <w:numPr>
+          <w:ilvl w:val="4"/>
+          <w:numId w:val="4"/>
+        </w:numPr>
+        <w:spacing w:before="184"/>
+        <w:ind w:left="2127" w:hanging="426"/>
+        <w:rPr>
+          <w:spacing w:val="-4"/>
+          <w:u w:val="single"/>
+        </w:rPr>
+      </w:pPr>
+      <w:r>
+        <w:rPr>
+          <w:b w:val="0"/>
+          <w:bCs w:val="0"/>
+          <w:spacing w:val="-4"/>
+          <w:sz w:val="24"/>
+          <w:szCs w:val="24"/>
+        </w:rPr>
+        <w:t>Thông tin đơn đặt phòng hát:</w:t>
+      </w:r>
+    </w:p>
+    <w:p>
+      <w:pPr>
+        <w:pStyle w:val="Heading3"/>
+        <w:numPr>
+          <w:ilvl w:val="5"/>
+          <w:numId w:val="4"/>
+        </w:numPr>
+        <w:spacing w:before="184"/>
+        <w:ind w:left="2694" w:hanging="426"/>
+        <w:rPr>
+          <w:spacing w:val="-4"/>
+          <w:u w:val="single"/>
+        </w:rPr>
+      </w:pPr>
+      <w:r>
+        <w:rPr>
+          <w:b w:val="0"/>
+          <w:bCs w:val="0"/>
+          <w:spacing w:val="-4"/>
+          <w:sz w:val="24"/>
+          <w:szCs w:val="24"/>
+        </w:rPr>
+        <w:t>Thông tin khách hàng: Tên khách hàng, Địa chỉ, Số điện thoại, Email.</w:t>
+      </w:r>
+    </w:p>
+    <w:p>
+      <w:pPr>
+        <w:pStyle w:val="Heading3"/>
+        <w:numPr>
+          <w:ilvl w:val="5"/>
+          <w:numId w:val="4"/>
+        </w:numPr>
+        <w:spacing w:before="184"/>
+        <w:ind w:left="2694" w:hanging="426"/>
+        <w:rPr>
+          <w:spacing w:val="-4"/>
+          <w:u w:val="single"/>
+        </w:rPr>
+      </w:pPr>
+      <w:r>
+        <w:rPr>
+          <w:b w:val="0"/>
+          <w:bCs w:val="0"/>
+          <w:spacing w:val="-4"/>
+          <w:sz w:val="24"/>
+          <w:szCs w:val="24"/>
+        </w:rPr>
+        <w:t>Thông tin phòng hat: Tên phòng, Kích cỡ, Loại phòng, Giá phòng theo giờ.</w:t>
+      </w:r>
+    </w:p>
+    <w:p>
+      <w:pPr>
+        <w:pStyle w:val="Heading3"/>
+        <w:numPr>
+          <w:ilvl w:val="5"/>
+          <w:numId w:val="4"/>
+        </w:numPr>
+        <w:spacing w:before="184"/>
+        <w:ind w:left="2694" w:hanging="426"/>
+        <w:rPr>
+          <w:spacing w:val="-4"/>
+          <w:u w:val="single"/>
+        </w:rPr>
+      </w:pPr>
+      <w:r>
+        <w:rPr>
+          <w:b w:val="0"/>
+          <w:bCs w:val="0"/>
+          <w:spacing w:val="-4"/>
+          <w:sz w:val="24"/>
+          <w:szCs w:val="24"/>
+        </w:rPr>
+        <w:t>Thời gian đặt phòng.</w:t>
+      </w:r>
+    </w:p>
+    <w:p>
+      <w:pPr>
+        <w:pStyle w:val="Heading3"/>
+        <w:numPr>
+          <w:ilvl w:val="5"/>
+          <w:numId w:val="4"/>
+        </w:numPr>
+        <w:spacing w:before="184"/>
+        <w:ind w:left="2694" w:hanging="426"/>
+        <w:rPr>
+          <w:spacing w:val="-4"/>
+          <w:u w:val="single"/>
+        </w:rPr>
+      </w:pPr>
+      <w:r>
+        <w:rPr>
+          <w:b w:val="0"/>
+          <w:bCs w:val="0"/>
+          <w:spacing w:val="-4"/>
+          <w:sz w:val="24"/>
+          <w:szCs w:val="24"/>
+        </w:rPr>
+        <w:t>Thời gian trả phòng.</w:t>
+      </w:r>
+    </w:p>
+    <w:p>
+      <w:pPr>
+        <w:pStyle w:val="Heading3"/>
+        <w:numPr>
+          <w:ilvl w:val="4"/>
+          <w:numId w:val="4"/>
+        </w:numPr>
+        <w:spacing w:before="184"/>
+        <w:ind w:left="2127"/>
+        <w:rPr>
+          <w:spacing w:val="-4"/>
+          <w:u w:val="single"/>
+        </w:rPr>
+      </w:pPr>
+      <w:r>
+        <w:rPr>
+          <w:b w:val="0"/>
+          <w:bCs w:val="0"/>
+          <w:spacing w:val="-4"/>
+          <w:sz w:val="24"/>
+          <w:szCs w:val="24"/>
+        </w:rPr>
+        <w:t>Thành tiền phòng.</w:t>
+      </w:r>
+    </w:p>
+    <w:p>
+      <w:pPr>
+        <w:pStyle w:val="Heading3"/>
+        <w:numPr>
+          <w:ilvl w:val="4"/>
+          <w:numId w:val="4"/>
+        </w:numPr>
+        <w:spacing w:before="184"/>
+        <w:ind w:left="2127"/>
+        <w:rPr>
+          <w:spacing w:val="-4"/>
+          <w:u w:val="single"/>
+        </w:rPr>
+      </w:pPr>
+      <w:r>
+        <w:rPr>
+          <w:b w:val="0"/>
+          <w:bCs w:val="0"/>
+          <w:spacing w:val="-4"/>
+          <w:sz w:val="24"/>
+          <w:szCs w:val="24"/>
+        </w:rPr>
+        <w:t>Danh sách mặt hàng / dịch vụ đã dùng: Mã mặt hàng, Tên mặt hàng, Số lượng, Đơn giá, Thành tiền.</w:t>
+      </w:r>
+    </w:p>
+    <w:p>
+      <w:pPr>
+        <w:pStyle w:val="Heading3"/>
+        <w:numPr>
+          <w:ilvl w:val="4"/>
+          <w:numId w:val="4"/>
+        </w:numPr>
+        <w:spacing w:before="184"/>
+        <w:ind w:left="2127"/>
+        <w:rPr>
+          <w:spacing w:val="-4"/>
+          <w:u w:val="single"/>
+        </w:rPr>
+      </w:pPr>
+      <w:r>
+        <w:rPr>
+          <w:b w:val="0"/>
+          <w:bCs w:val="0"/>
+          <w:spacing w:val="-4"/>
+          <w:sz w:val="24"/>
+          <w:szCs w:val="24"/>
+        </w:rPr>
+        <w:t>Tổng tiền thanh toán.</w:t>
+      </w:r>
+    </w:p>
+    <w:p>
+      <w:pPr>
+        <w:pStyle w:val="Heading3"/>
+        <w:spacing w:before="184"/>
         <w:rPr>
           <w:spacing w:val="-4"/>
           <w:u w:val="single"/>
@@ -24616,6 +25297,7 @@
           <w:bCs w:val="0"/>
           <w:spacing w:val="-4"/>
         </w:rPr>
+        <w:lastRenderedPageBreak/>
         <w:t xml:space="preserve">Quản lí chọn chức năng </w:t>
       </w:r>
       <w:r>
@@ -25157,7 +25839,6 @@
           <w:bCs w:val="0"/>
           <w:spacing w:val="-4"/>
         </w:rPr>
-        <w:lastRenderedPageBreak/>
         <w:t xml:space="preserve">Quản lí nhập Ngày bắt đầu, Ngày kết thúc mong muốn rồi nhấn nút Xem thống kê </w:t>
       </w:r>
       <w:r>
@@ -25248,6 +25929,7 @@
           <w:bCs w:val="0"/>
           <w:spacing w:val="-4"/>
         </w:rPr>
+        <w:lastRenderedPageBreak/>
         <w:t xml:space="preserve">Quản lí click vào nút Quay lại trên giao diện hiện tại </w:t>
       </w:r>
       <w:r>
@@ -25836,7 +26518,6 @@
           <w:bCs w:val="0"/>
           <w:spacing w:val="-4"/>
         </w:rPr>
-        <w:lastRenderedPageBreak/>
         <w:t>Email.</w:t>
       </w:r>
       <w:bookmarkEnd w:id="97"/>
@@ -26020,6 +26701,7 @@
           <w:bCs w:val="0"/>
           <w:spacing w:val="-4"/>
         </w:rPr>
+        <w:lastRenderedPageBreak/>
         <w:t>Mã mặt hàng.</w:t>
       </w:r>
       <w:bookmarkEnd w:id="104"/>
@@ -26128,7 +26810,6 @@
         <w:ind w:left="1418" w:hanging="284"/>
       </w:pPr>
       <w:bookmarkStart w:id="109" w:name="_Toc223433097"/>
-      <w:proofErr w:type="spellStart"/>
       <w:r>
         <w:rPr>
           <w:b w:val="0"/>
@@ -26137,7 +26818,6 @@
         </w:rPr>
         <w:t>Tên</w:t>
       </w:r>
-      <w:proofErr w:type="spellEnd"/>
       <w:r>
         <w:rPr>
           <w:b w:val="0"/>
@@ -26545,7 +27225,6 @@
           <w:bCs w:val="0"/>
           <w:spacing w:val="-4"/>
         </w:rPr>
-        <w:lastRenderedPageBreak/>
         <w:t>Mã hóa đơn.</w:t>
       </w:r>
       <w:bookmarkEnd w:id="125"/>
@@ -26563,7 +27242,8 @@
           <w:spacing w:val="-4"/>
         </w:rPr>
       </w:pPr>
-      <w:bookmarkStart w:id="126" w:name="_Toc223433114"/>
+      <w:bookmarkStart w:id="126" w:name="_Toc223433117"/>
+      <w:bookmarkStart w:id="127" w:name="_Toc223433114"/>
       <w:r>
         <w:rPr>
           <w:b w:val="0"/>
@@ -26572,7 +27252,7 @@
         </w:rPr>
         <w:t>Thông tin nhân viên tạo hóa đơn: Mã nhân viên, Tên nhân viên, Chức vụ.</w:t>
       </w:r>
-      <w:bookmarkEnd w:id="126"/>
+      <w:bookmarkEnd w:id="127"/>
     </w:p>
     <w:p>
       <w:pPr>
@@ -26587,7 +27267,7 @@
           <w:spacing w:val="-4"/>
         </w:rPr>
       </w:pPr>
-      <w:bookmarkStart w:id="127" w:name="_Toc223433115"/>
+      <w:bookmarkStart w:id="128" w:name="_Toc223433115"/>
       <w:r>
         <w:rPr>
           <w:b w:val="0"/>
@@ -26603,33 +27283,9 @@
           <w:bCs w:val="0"/>
           <w:spacing w:val="-4"/>
         </w:rPr>
-        <w:t xml:space="preserve"> tin</w:t>
-      </w:r>
-      <w:r>
-        <w:rPr>
-          <w:b w:val="0"/>
-          <w:bCs w:val="0"/>
-          <w:spacing w:val="-4"/>
-        </w:rPr>
-        <w:t xml:space="preserve"> đơn đặt</w:t>
-      </w:r>
-      <w:r>
-        <w:rPr>
-          <w:b w:val="0"/>
-          <w:bCs w:val="0"/>
-          <w:spacing w:val="-4"/>
-        </w:rPr>
-        <w:t xml:space="preserve"> phòng </w:t>
-      </w:r>
-      <w:r>
-        <w:rPr>
-          <w:b w:val="0"/>
-          <w:bCs w:val="0"/>
-          <w:spacing w:val="-4"/>
-        </w:rPr>
-        <w:t>hát:</w:t>
-      </w:r>
-      <w:bookmarkEnd w:id="127"/>
+        <w:t xml:space="preserve"> tin đơn đặt phòng hát:</w:t>
+      </w:r>
+      <w:bookmarkEnd w:id="128"/>
     </w:p>
     <w:p>
       <w:pPr>
@@ -26644,7 +27300,7 @@
           <w:spacing w:val="-4"/>
         </w:rPr>
       </w:pPr>
-      <w:bookmarkStart w:id="128" w:name="_Toc223433116"/>
+      <w:bookmarkStart w:id="129" w:name="_Toc223433116"/>
       <w:r>
         <w:rPr>
           <w:b w:val="0"/>
@@ -26655,7 +27311,7 @@
         </w:rPr>
         <w:t>Thông tin khách hàng: Tên khách hàng, Địa chỉ, Số điện thoại, Email.</w:t>
       </w:r>
-      <w:bookmarkEnd w:id="128"/>
+      <w:bookmarkEnd w:id="129"/>
     </w:p>
     <w:p>
       <w:pPr>
@@ -26670,7 +27326,6 @@
           <w:spacing w:val="-4"/>
         </w:rPr>
       </w:pPr>
-      <w:bookmarkStart w:id="129" w:name="_Toc223433117"/>
       <w:r>
         <w:rPr>
           <w:b w:val="0"/>
@@ -26679,9 +27334,19 @@
           <w:sz w:val="24"/>
           <w:szCs w:val="24"/>
         </w:rPr>
-        <w:t>Thông tin phòng hát: Tên phòng, Kích cỡ, Loại phòng, Giá phòng theo giờ.</w:t>
-      </w:r>
-      <w:bookmarkEnd w:id="129"/>
+        <w:t xml:space="preserve">Thông tin phòng </w:t>
+      </w:r>
+      <w:r>
+        <w:rPr>
+          <w:b w:val="0"/>
+          <w:bCs w:val="0"/>
+          <w:spacing w:val="-4"/>
+          <w:sz w:val="24"/>
+          <w:szCs w:val="24"/>
+        </w:rPr>
+        <w:t>hát: Tên phòng, Kích cỡ, Loại phòng, Giá phòng theo giờ.</w:t>
+      </w:r>
+      <w:bookmarkEnd w:id="126"/>
     </w:p>
     <w:p>
       <w:pPr>
@@ -26731,6 +27396,7 @@
           <w:sz w:val="24"/>
           <w:szCs w:val="24"/>
         </w:rPr>
+        <w:lastRenderedPageBreak/>
         <w:t>Thời gian trả phòng</w:t>
       </w:r>
       <w:r>
@@ -27251,7 +27917,6 @@
           <w:bCs w:val="0"/>
           <w:spacing w:val="-4"/>
         </w:rPr>
-        <w:lastRenderedPageBreak/>
         <w:t>Tổng số tiền thu được.</w:t>
       </w:r>
       <w:bookmarkEnd w:id="152"/>
@@ -27617,7 +28282,18 @@
           <w:sz w:val="28"/>
           <w:szCs w:val="28"/>
         </w:rPr>
-        <w:t xml:space="preserve">hân viên có thể </w:t>
+        <w:t xml:space="preserve">hân viên </w:t>
+      </w:r>
+      <w:r>
+        <w:rPr>
+          <w:b w:val="0"/>
+          <w:bCs w:val="0"/>
+          <w:spacing w:val="-4"/>
+          <w:sz w:val="28"/>
+          <w:szCs w:val="28"/>
+        </w:rPr>
+        <w:lastRenderedPageBreak/>
+        <w:t xml:space="preserve">có thể </w:t>
       </w:r>
       <w:r>
         <w:rPr>
@@ -28008,6 +28684,15 @@
         </w:rPr>
       </w:pPr>
       <w:bookmarkStart w:id="163" w:name="_Toc223433151"/>
+      <w:r>
+        <w:rPr>
+          <w:spacing w:val="-4"/>
+          <w:sz w:val="28"/>
+          <w:szCs w:val="28"/>
+          <w:u w:val="single"/>
+        </w:rPr>
+        <w:t xml:space="preserve">1. </w:t>
+      </w:r>
       <w:r>
         <w:rPr>
           <w:spacing w:val="-4"/>
@@ -28263,26 +28948,22 @@
       <w:bookmarkStart w:id="172" w:name="_Toc223433158"/>
       <w:r>
         <w:rPr>
-          <w:b w:val="0"/>
-          <w:bCs w:val="0"/>
           <w:noProof/>
-          <w:spacing w:val="-4"/>
-          <w:sz w:val="24"/>
-          <w:szCs w:val="24"/>
-        </w:rPr>
+        </w:rPr>
+        <w:lastRenderedPageBreak/>
         <w:drawing>
-          <wp:anchor distT="0" distB="0" distL="114300" distR="114300" simplePos="0" relativeHeight="251660800" behindDoc="0" locked="0" layoutInCell="1" allowOverlap="1" wp14:anchorId="27933FFE" wp14:editId="1C45598D">
+          <wp:anchor distT="0" distB="0" distL="114300" distR="114300" simplePos="0" relativeHeight="251660800" behindDoc="0" locked="0" layoutInCell="1" allowOverlap="1" wp14:anchorId="3F3460F2" wp14:editId="29689AA4">
             <wp:simplePos x="0" y="0"/>
-            <wp:positionH relativeFrom="margin">
-              <wp:align>left</wp:align>
+            <wp:positionH relativeFrom="page">
+              <wp:align>center</wp:align>
             </wp:positionH>
             <wp:positionV relativeFrom="paragraph">
-              <wp:posOffset>365125</wp:posOffset>
+              <wp:posOffset>429260</wp:posOffset>
             </wp:positionV>
-            <wp:extent cx="6179820" cy="4221480"/>
+            <wp:extent cx="4884420" cy="3840480"/>
             <wp:effectExtent l="0" t="0" r="0" b="7620"/>
             <wp:wrapTopAndBottom/>
-            <wp:docPr id="542854197" name="Picture 3"/>
+            <wp:docPr id="938725182" name="Picture 5"/>
             <wp:cNvGraphicFramePr>
               <a:graphicFrameLocks xmlns:a="http://schemas.openxmlformats.org/drawingml/2006/main" noChangeAspect="1"/>
             </wp:cNvGraphicFramePr>
@@ -28290,7 +28971,7 @@
               <a:graphicData uri="http://schemas.openxmlformats.org/drawingml/2006/picture">
                 <pic:pic xmlns:pic="http://schemas.openxmlformats.org/drawingml/2006/picture">
                   <pic:nvPicPr>
-                    <pic:cNvPr id="0" name="Picture 3"/>
+                    <pic:cNvPr id="0" name="Picture 11"/>
                     <pic:cNvPicPr>
                       <a:picLocks noChangeAspect="1" noChangeArrowheads="1"/>
                     </pic:cNvPicPr>
@@ -28311,7 +28992,7 @@
                   <pic:spPr bwMode="auto">
                     <a:xfrm>
                       <a:off x="0" y="0"/>
-                      <a:ext cx="6179820" cy="4221480"/>
+                      <a:ext cx="4884420" cy="3840480"/>
                     </a:xfrm>
                     <a:prstGeom prst="rect">
                       <a:avLst/>
@@ -28356,6 +29037,18 @@
     <w:p>
       <w:pPr>
         <w:pStyle w:val="Heading3"/>
+        <w:spacing w:before="184"/>
+        <w:ind w:left="1134"/>
+        <w:rPr>
+          <w:spacing w:val="-4"/>
+          <w:sz w:val="32"/>
+          <w:szCs w:val="32"/>
+        </w:rPr>
+      </w:pPr>
+    </w:p>
+    <w:p>
+      <w:pPr>
+        <w:pStyle w:val="Heading3"/>
         <w:numPr>
           <w:ilvl w:val="3"/>
           <w:numId w:val="4"/>
@@ -28554,6 +29247,66 @@
         </w:rPr>
         <w:t xml:space="preserve"> </w:t>
       </w:r>
+    </w:p>
+    <w:p>
+      <w:pPr>
+        <w:pStyle w:val="Heading3"/>
+        <w:spacing w:before="184"/>
+        <w:ind w:left="1701"/>
+        <w:rPr>
+          <w:spacing w:val="-4"/>
+          <w:sz w:val="32"/>
+          <w:szCs w:val="32"/>
+        </w:rPr>
+      </w:pPr>
+    </w:p>
+    <w:p>
+      <w:pPr>
+        <w:pStyle w:val="Heading3"/>
+        <w:spacing w:before="184"/>
+        <w:ind w:left="1701"/>
+        <w:rPr>
+          <w:spacing w:val="-4"/>
+          <w:sz w:val="32"/>
+          <w:szCs w:val="32"/>
+        </w:rPr>
+      </w:pPr>
+    </w:p>
+    <w:p>
+      <w:pPr>
+        <w:pStyle w:val="Heading3"/>
+        <w:numPr>
+          <w:ilvl w:val="2"/>
+          <w:numId w:val="4"/>
+        </w:numPr>
+        <w:spacing w:before="184"/>
+        <w:rPr>
+          <w:spacing w:val="-4"/>
+          <w:sz w:val="32"/>
+          <w:szCs w:val="32"/>
+        </w:rPr>
+      </w:pPr>
+      <w:r>
+        <w:rPr>
+          <w:spacing w:val="-4"/>
+          <w:sz w:val="28"/>
+          <w:szCs w:val="28"/>
+          <w:u w:val="single"/>
+        </w:rPr>
+        <w:t>2. Use case chi tiết (Module:):</w:t>
+      </w:r>
+    </w:p>
+    <w:p>
+      <w:pPr>
+        <w:pStyle w:val="Heading3"/>
+        <w:spacing w:before="184"/>
+        <w:ind w:left="5760"/>
+        <w:rPr>
+          <w:spacing w:val="-4"/>
+          <w:sz w:val="32"/>
+          <w:szCs w:val="32"/>
+        </w:rPr>
+      </w:pPr>
     </w:p>
     <w:sectPr>
       <w:pgSz w:w="12240" w:h="15840"/>
@@ -31061,7 +31814,7 @@
   <w:abstractNum w:abstractNumId="16" w15:restartNumberingAfterBreak="0">
     <w:nsid w:val="474A3112"/>
     <w:multiLevelType w:val="hybridMultilevel"/>
-    <w:tmpl w:val="CFDA9494"/>
+    <w:tmpl w:val="C2D623D2"/>
     <w:lvl w:ilvl="0" w:tplc="7B225398">
       <w:start w:val="2"/>
       <w:numFmt w:val="upperRoman"/>
@@ -31130,7 +31883,7 @@
       <w:lvlText w:val="+"/>
       <w:lvlJc w:val="left"/>
       <w:pPr>
-        <w:ind w:left="3282" w:hanging="360"/>
+        <w:ind w:left="3763" w:hanging="360"/>
       </w:pPr>
       <w:rPr>
         <w:rFonts w:ascii="Courier New" w:hAnsi="Courier New" w:hint="default"/>
@@ -31138,16 +31891,18 @@
         <w:szCs w:val="24"/>
       </w:rPr>
     </w:lvl>
-    <w:lvl w:ilvl="4" w:tplc="04090001">
+    <w:lvl w:ilvl="4" w:tplc="B03A1828">
       <w:start w:val="1"/>
       <w:numFmt w:val="bullet"/>
       <w:lvlText w:val=""/>
       <w:lvlJc w:val="left"/>
       <w:pPr>
-        <w:ind w:left="4253" w:hanging="360"/>
+        <w:ind w:left="5039" w:hanging="360"/>
       </w:pPr>
       <w:rPr>
         <w:rFonts w:ascii="Symbol" w:hAnsi="Symbol" w:hint="default"/>
+        <w:sz w:val="28"/>
+        <w:szCs w:val="28"/>
       </w:rPr>
     </w:lvl>
     <w:lvl w:ilvl="5" w:tplc="62AA8ED0">

</xml_diff>

<commit_message>
refactor module của Đạt
</commit_message>
<xml_diff>
--- a/N06-13-Quản lý nhà hàng Karaoke-Pha yêu cầu.docx
+++ b/N06-13-Quản lý nhà hàng Karaoke-Pha yêu cầu.docx
@@ -25533,7 +25533,23 @@
           <w:bCs w:val="0"/>
           <w:spacing w:val="-4"/>
         </w:rPr>
-        <w:t xml:space="preserve"> với nút thao tác Quay lại được đặt ở dưới cùng</w:t>
+        <w:t xml:space="preserve"> với nút thao tác Quay lại</w:t>
+      </w:r>
+      <w:r>
+        <w:rPr>
+          <w:b w:val="0"/>
+          <w:bCs w:val="0"/>
+          <w:spacing w:val="-4"/>
+        </w:rPr>
+        <w:t xml:space="preserve"> và Xuất phiếu lương than toán</w:t>
+      </w:r>
+      <w:r>
+        <w:rPr>
+          <w:b w:val="0"/>
+          <w:bCs w:val="0"/>
+          <w:spacing w:val="-4"/>
+        </w:rPr>
+        <w:t xml:space="preserve"> được đặt ở dưới cùng</w:t>
       </w:r>
       <w:r>
         <w:rPr>
@@ -25583,14 +25599,30 @@
           <w:u w:val="single"/>
         </w:rPr>
       </w:pPr>
-      <w:bookmarkStart w:id="74" w:name="_Toc223433062"/>
-      <w:r>
-        <w:rPr>
-          <w:b w:val="0"/>
-          <w:bCs w:val="0"/>
-          <w:spacing w:val="-4"/>
-        </w:rPr>
-        <w:t xml:space="preserve">Quản lí nhấn vào nút Quay lại trên giao diện hiện tại </w:t>
+      <w:r>
+        <w:rPr>
+          <w:b w:val="0"/>
+          <w:bCs w:val="0"/>
+          <w:spacing w:val="-4"/>
+          <w:lang w:val="en-US"/>
+        </w:rPr>
+        <w:t>Sau</w:t>
+      </w:r>
+      <w:r>
+        <w:rPr>
+          <w:b w:val="0"/>
+          <w:bCs w:val="0"/>
+          <w:spacing w:val="-4"/>
+        </w:rPr>
+        <w:t xml:space="preserve"> khi hoàn thành kiểm tra, quản lý nhấn nút Xuất phiếu lương thanh toán</w:t>
+      </w:r>
+      <w:r>
+        <w:rPr>
+          <w:b w:val="0"/>
+          <w:bCs w:val="0"/>
+          <w:spacing w:val="-4"/>
+        </w:rPr>
+        <w:t xml:space="preserve"> </w:t>
       </w:r>
       <w:r>
         <w:rPr>
@@ -25606,59 +25638,8 @@
           <w:bCs w:val="0"/>
           <w:spacing w:val="-4"/>
         </w:rPr>
-        <w:t xml:space="preserve"> Hệ thống đóng bảng chi tiết và trở về lại giao diện danh sách bảng Tiền công của tất cả các nhân viên </w:t>
-      </w:r>
-      <w:r>
-        <w:rPr>
-          <w:b w:val="0"/>
-          <w:bCs w:val="0"/>
-          <w:spacing w:val="-4"/>
-        </w:rPr>
-        <w:t>→</w:t>
-      </w:r>
-      <w:r>
-        <w:rPr>
-          <w:b w:val="0"/>
-          <w:bCs w:val="0"/>
-          <w:spacing w:val="-4"/>
-        </w:rPr>
-        <w:t xml:space="preserve"> Quản lí tiếp tục thao tác.</w:t>
-      </w:r>
-      <w:bookmarkEnd w:id="74"/>
-    </w:p>
-    <w:p>
-      <w:pPr>
-        <w:pStyle w:val="Heading3"/>
-        <w:spacing w:before="184"/>
-        <w:ind w:left="1418"/>
-        <w:rPr>
-          <w:spacing w:val="-4"/>
-          <w:u w:val="single"/>
-        </w:rPr>
-      </w:pPr>
-    </w:p>
-    <w:p>
-      <w:pPr>
-        <w:pStyle w:val="Heading3"/>
-        <w:numPr>
-          <w:ilvl w:val="2"/>
-          <w:numId w:val="4"/>
-        </w:numPr>
-        <w:spacing w:before="184"/>
-        <w:rPr>
-          <w:spacing w:val="-4"/>
-          <w:u w:val="single"/>
-        </w:rPr>
-      </w:pPr>
-      <w:bookmarkStart w:id="75" w:name="_Toc223433063"/>
-      <w:r>
-        <w:rPr>
-          <w:spacing w:val="-4"/>
-          <w:u w:val="single"/>
-        </w:rPr>
-        <w:t>Module “Thống kê khung giờ theo lượt khách”:</w:t>
-      </w:r>
-      <w:bookmarkEnd w:id="75"/>
+        <w:t xml:space="preserve"> Hệ thống hiện ra giao diện Phiếu chi tiết lương thanh toán của nhân viên đó với các thông tin:</w:t>
+      </w:r>
     </w:p>
     <w:p>
       <w:pPr>
@@ -25674,20 +25655,13 @@
           <w:u w:val="single"/>
         </w:rPr>
       </w:pPr>
-      <w:bookmarkStart w:id="76" w:name="_Toc223433064"/>
-      <w:r>
-        <w:rPr>
-          <w:b w:val="0"/>
-          <w:bCs w:val="0"/>
-          <w:spacing w:val="-4"/>
-        </w:rPr>
-        <w:t xml:space="preserve">Quản lí chọn chức năng </w:t>
-      </w:r>
-      <w:r>
-        <w:rPr>
-          <w:spacing w:val="-4"/>
-        </w:rPr>
-        <w:t xml:space="preserve">Thống kê khung giờ theo lượt khách </w:t>
+      <w:r>
+        <w:rPr>
+          <w:b w:val="0"/>
+          <w:bCs w:val="0"/>
+          <w:spacing w:val="-4"/>
+        </w:rPr>
+        <w:t xml:space="preserve">Quản lý yêu cầu nhân viên kiểm tra phiếu lương </w:t>
       </w:r>
       <w:r>
         <w:rPr>
@@ -25703,9 +25677,188 @@
           <w:bCs w:val="0"/>
           <w:spacing w:val="-4"/>
         </w:rPr>
-        <w:t xml:space="preserve"> Hệ thống chuyển sang giao diện với các ô nhập thông tin (Ngày bắt đầu, Ngày kết thúc) và nút thao tác Xem thống kê.</w:t>
-      </w:r>
-      <w:bookmarkEnd w:id="76"/>
+        <w:t xml:space="preserve"> Nhân viên kiểm tra các thông tin trên</w:t>
+      </w:r>
+    </w:p>
+    <w:p>
+      <w:pPr>
+        <w:pStyle w:val="Heading3"/>
+        <w:numPr>
+          <w:ilvl w:val="4"/>
+          <w:numId w:val="4"/>
+        </w:numPr>
+        <w:spacing w:before="184"/>
+        <w:ind w:left="2127" w:hanging="426"/>
+        <w:rPr>
+          <w:spacing w:val="-4"/>
+          <w:sz w:val="24"/>
+          <w:szCs w:val="24"/>
+          <w:u w:val="single"/>
+        </w:rPr>
+      </w:pPr>
+      <w:r>
+        <w:rPr>
+          <w:b w:val="0"/>
+          <w:bCs w:val="0"/>
+          <w:spacing w:val="-4"/>
+          <w:sz w:val="24"/>
+          <w:szCs w:val="24"/>
+        </w:rPr>
+        <w:t xml:space="preserve">Nếu thông tin chính xác, quản lý nhấn nút Xác nhận </w:t>
+      </w:r>
+      <w:r>
+        <w:rPr>
+          <w:b w:val="0"/>
+          <w:bCs w:val="0"/>
+          <w:spacing w:val="-4"/>
+          <w:sz w:val="24"/>
+          <w:szCs w:val="24"/>
+        </w:rPr>
+        <w:t>→</w:t>
+      </w:r>
+      <w:r>
+        <w:rPr>
+          <w:b w:val="0"/>
+          <w:bCs w:val="0"/>
+          <w:spacing w:val="-4"/>
+          <w:sz w:val="24"/>
+          <w:szCs w:val="24"/>
+        </w:rPr>
+        <w:t xml:space="preserve"> </w:t>
+      </w:r>
+      <w:r>
+        <w:rPr>
+          <w:b w:val="0"/>
+          <w:bCs w:val="0"/>
+          <w:spacing w:val="-4"/>
+          <w:sz w:val="24"/>
+          <w:szCs w:val="24"/>
+        </w:rPr>
+        <w:t>Hệ thống thông báo “Xác nhận phiếu lương thành công”, trở lại giao diện Danh sách bảng tính công cho tất cả nhân viên quản lý tiếp tục tính công cho các nhân viên còn lại.</w:t>
+      </w:r>
+    </w:p>
+    <w:p>
+      <w:pPr>
+        <w:pStyle w:val="Heading3"/>
+        <w:numPr>
+          <w:ilvl w:val="4"/>
+          <w:numId w:val="4"/>
+        </w:numPr>
+        <w:spacing w:before="184"/>
+        <w:ind w:left="2127" w:hanging="426"/>
+        <w:rPr>
+          <w:spacing w:val="-4"/>
+          <w:sz w:val="24"/>
+          <w:szCs w:val="24"/>
+          <w:u w:val="single"/>
+        </w:rPr>
+      </w:pPr>
+      <w:r>
+        <w:rPr>
+          <w:b w:val="0"/>
+          <w:bCs w:val="0"/>
+          <w:spacing w:val="-4"/>
+          <w:sz w:val="24"/>
+          <w:szCs w:val="24"/>
+        </w:rPr>
+        <w:t xml:space="preserve">Nếu thông tin không chính xác, nhân viên thông báo cho quản lý để kiểm tra lại </w:t>
+      </w:r>
+      <w:r>
+        <w:rPr>
+          <w:b w:val="0"/>
+          <w:bCs w:val="0"/>
+          <w:spacing w:val="-4"/>
+          <w:sz w:val="24"/>
+          <w:szCs w:val="24"/>
+        </w:rPr>
+        <w:t>→</w:t>
+      </w:r>
+      <w:r>
+        <w:rPr>
+          <w:b w:val="0"/>
+          <w:bCs w:val="0"/>
+          <w:spacing w:val="-4"/>
+          <w:sz w:val="24"/>
+          <w:szCs w:val="24"/>
+        </w:rPr>
+        <w:t xml:space="preserve"> Nếu phát hiện sai sót, quản lý cập nhật dữ liệu liên quan </w:t>
+      </w:r>
+      <w:r>
+        <w:rPr>
+          <w:b w:val="0"/>
+          <w:bCs w:val="0"/>
+          <w:spacing w:val="-4"/>
+          <w:sz w:val="24"/>
+          <w:szCs w:val="24"/>
+        </w:rPr>
+        <w:t>→</w:t>
+      </w:r>
+      <w:r>
+        <w:rPr>
+          <w:b w:val="0"/>
+          <w:bCs w:val="0"/>
+          <w:spacing w:val="-4"/>
+          <w:sz w:val="24"/>
+          <w:szCs w:val="24"/>
+        </w:rPr>
+        <w:t xml:space="preserve"> Hệ thống tính lại bảng tiền công cho nhân viên </w:t>
+      </w:r>
+      <w:r>
+        <w:rPr>
+          <w:b w:val="0"/>
+          <w:bCs w:val="0"/>
+          <w:spacing w:val="-4"/>
+          <w:sz w:val="24"/>
+          <w:szCs w:val="24"/>
+        </w:rPr>
+        <w:t>→</w:t>
+      </w:r>
+      <w:r>
+        <w:rPr>
+          <w:b w:val="0"/>
+          <w:bCs w:val="0"/>
+          <w:spacing w:val="-4"/>
+          <w:sz w:val="24"/>
+          <w:szCs w:val="24"/>
+        </w:rPr>
+        <w:t xml:space="preserve"> Quản lí xuất lại phiếu lương thanh toán để nhân viên kiểm tra lại.</w:t>
+      </w:r>
+    </w:p>
+    <w:p>
+      <w:pPr>
+        <w:pStyle w:val="Heading3"/>
+        <w:spacing w:before="184"/>
+        <w:ind w:left="1701"/>
+        <w:rPr>
+          <w:spacing w:val="-4"/>
+          <w:sz w:val="24"/>
+          <w:szCs w:val="24"/>
+          <w:u w:val="single"/>
+        </w:rPr>
+      </w:pPr>
+    </w:p>
+    <w:p>
+      <w:pPr>
+        <w:pStyle w:val="Heading3"/>
+        <w:numPr>
+          <w:ilvl w:val="2"/>
+          <w:numId w:val="4"/>
+        </w:numPr>
+        <w:spacing w:before="184"/>
+        <w:rPr>
+          <w:spacing w:val="-4"/>
+          <w:u w:val="single"/>
+        </w:rPr>
+      </w:pPr>
+      <w:bookmarkStart w:id="74" w:name="_Toc223433063"/>
+      <w:r>
+        <w:rPr>
+          <w:spacing w:val="-4"/>
+          <w:u w:val="single"/>
+        </w:rPr>
+        <w:t>Module “Thống kê khung giờ theo lượt khách”:</w:t>
+      </w:r>
+      <w:bookmarkEnd w:id="74"/>
     </w:p>
     <w:p>
       <w:pPr>
@@ -25721,14 +25874,20 @@
           <w:u w:val="single"/>
         </w:rPr>
       </w:pPr>
-      <w:bookmarkStart w:id="77" w:name="_Toc223433065"/>
-      <w:r>
-        <w:rPr>
-          <w:b w:val="0"/>
-          <w:bCs w:val="0"/>
-          <w:spacing w:val="-4"/>
-        </w:rPr>
-        <w:t xml:space="preserve">Quản lí nhập Ngày bắt đầu, Ngày kết thúc mong muốn rồi nhấn nút Xem thống kê </w:t>
+      <w:bookmarkStart w:id="75" w:name="_Toc223433064"/>
+      <w:r>
+        <w:rPr>
+          <w:b w:val="0"/>
+          <w:bCs w:val="0"/>
+          <w:spacing w:val="-4"/>
+        </w:rPr>
+        <w:t xml:space="preserve">Quản lí chọn chức năng </w:t>
+      </w:r>
+      <w:r>
+        <w:rPr>
+          <w:spacing w:val="-4"/>
+        </w:rPr>
+        <w:t xml:space="preserve">Thống kê khung giờ theo lượt khách </w:t>
       </w:r>
       <w:r>
         <w:rPr>
@@ -25744,17 +25903,9 @@
           <w:bCs w:val="0"/>
           <w:spacing w:val="-4"/>
         </w:rPr>
-        <w:t xml:space="preserve"> Hệ thống truy xuất dữ liệu và hiển thị danh sách khung giờ dưới dạng bảng. Bảng này có chính xác 24 dòng tương ứng với 24 khung giờ trong ngày, với mỗi dòng chứa các thông tin: Khung giờ, Tổng số lượt khách thuê phòng hát, Tổng số tiền thu </w:t>
-      </w:r>
-      <w:r>
-        <w:rPr>
-          <w:b w:val="0"/>
-          <w:bCs w:val="0"/>
-          <w:spacing w:val="-4"/>
-        </w:rPr>
-        <w:t>được. Bảng được hệ thống tự động sắp xếp theo chiều giảm dần của tổng số lần khách dùng phòng, tiếp theo là giảm dần của tổng tiền thu được.</w:t>
-      </w:r>
-      <w:bookmarkEnd w:id="77"/>
+        <w:t xml:space="preserve"> Hệ thống chuyển sang giao diện với các ô nhập thông tin (Ngày bắt đầu, Ngày kết thúc) và nút thao tác Xem thống kê.</w:t>
+      </w:r>
+      <w:bookmarkEnd w:id="75"/>
     </w:p>
     <w:p>
       <w:pPr>
@@ -25770,14 +25921,14 @@
           <w:u w:val="single"/>
         </w:rPr>
       </w:pPr>
-      <w:bookmarkStart w:id="78" w:name="_Toc223433066"/>
-      <w:r>
-        <w:rPr>
-          <w:b w:val="0"/>
-          <w:bCs w:val="0"/>
-          <w:spacing w:val="-4"/>
-        </w:rPr>
-        <w:t xml:space="preserve">Quản lí click vào một dòng của 1 khung giờ bất kỳ trên bảng để xem chi tiết thông tin </w:t>
+      <w:bookmarkStart w:id="76" w:name="_Toc223433065"/>
+      <w:r>
+        <w:rPr>
+          <w:b w:val="0"/>
+          <w:bCs w:val="0"/>
+          <w:spacing w:val="-4"/>
+        </w:rPr>
+        <w:t xml:space="preserve">Quản lí nhập Ngày bắt đầu, Ngày kết thúc mong muốn rồi nhấn nút Xem thống kê </w:t>
       </w:r>
       <w:r>
         <w:rPr>
@@ -25793,9 +25944,26 @@
           <w:bCs w:val="0"/>
           <w:spacing w:val="-4"/>
         </w:rPr>
-        <w:t xml:space="preserve"> Giao diện chi tiết hiện lên với danh sách các hóa đơn đã được thanh toán trong khung giờ đó được hiển thị dưới dạng bảng, với mỗi dòng tương ứng với một hóa đơn: Mã hóa đơn, Tên khách hàng, Ngày giờ, Tổng tiền.</w:t>
-      </w:r>
-      <w:bookmarkEnd w:id="78"/>
+        <w:t xml:space="preserve"> </w:t>
+      </w:r>
+      <w:r>
+        <w:rPr>
+          <w:b w:val="0"/>
+          <w:bCs w:val="0"/>
+          <w:spacing w:val="-4"/>
+        </w:rPr>
+        <w:lastRenderedPageBreak/>
+        <w:t xml:space="preserve">Hệ thống truy xuất dữ liệu và hiển thị danh sách khung giờ dưới dạng bảng. Bảng này có chính xác 24 dòng tương ứng với 24 khung giờ trong ngày, với mỗi dòng chứa các thông tin: Khung giờ, Tổng số lượt khách thuê phòng hát, Tổng số tiền thu </w:t>
+      </w:r>
+      <w:r>
+        <w:rPr>
+          <w:b w:val="0"/>
+          <w:bCs w:val="0"/>
+          <w:spacing w:val="-4"/>
+        </w:rPr>
+        <w:t>được. Bảng được hệ thống tự động sắp xếp theo chiều giảm dần của tổng số lần khách dùng phòng, tiếp theo là giảm dần của tổng tiền thu được.</w:t>
+      </w:r>
+      <w:bookmarkEnd w:id="76"/>
     </w:p>
     <w:p>
       <w:pPr>
@@ -25811,15 +25979,14 @@
           <w:u w:val="single"/>
         </w:rPr>
       </w:pPr>
-      <w:bookmarkStart w:id="79" w:name="_Toc223433067"/>
-      <w:r>
-        <w:rPr>
-          <w:b w:val="0"/>
-          <w:bCs w:val="0"/>
-          <w:spacing w:val="-4"/>
-        </w:rPr>
-        <w:lastRenderedPageBreak/>
-        <w:t xml:space="preserve">Quản lí click vào nút Quay lại trên giao diện hiện tại </w:t>
+      <w:bookmarkStart w:id="77" w:name="_Toc223433066"/>
+      <w:r>
+        <w:rPr>
+          <w:b w:val="0"/>
+          <w:bCs w:val="0"/>
+          <w:spacing w:val="-4"/>
+        </w:rPr>
+        <w:t xml:space="preserve">Quản lí click vào một dòng của 1 khung giờ bất kỳ trên bảng để xem chi tiết thông tin </w:t>
       </w:r>
       <w:r>
         <w:rPr>
@@ -25835,80 +26002,9 @@
           <w:bCs w:val="0"/>
           <w:spacing w:val="-4"/>
         </w:rPr>
-        <w:t xml:space="preserve"> Hệ thống đóng bảng chi tiết và trở về lại giao diện danh sách Thống kê khung giờ theo lượt khách </w:t>
-      </w:r>
-      <w:r>
-        <w:rPr>
-          <w:b w:val="0"/>
-          <w:bCs w:val="0"/>
-          <w:spacing w:val="-4"/>
-        </w:rPr>
-        <w:t>→</w:t>
-      </w:r>
-      <w:r>
-        <w:rPr>
-          <w:b w:val="0"/>
-          <w:bCs w:val="0"/>
-          <w:spacing w:val="-4"/>
-        </w:rPr>
-        <w:t xml:space="preserve"> Quản lí tiếp tục thao tác.</w:t>
-      </w:r>
-      <w:bookmarkEnd w:id="79"/>
-    </w:p>
-    <w:p>
-      <w:pPr>
-        <w:pStyle w:val="Heading3"/>
-        <w:spacing w:before="184"/>
-        <w:ind w:left="1418"/>
-        <w:rPr>
-          <w:spacing w:val="-4"/>
-          <w:u w:val="single"/>
-        </w:rPr>
-      </w:pPr>
-    </w:p>
-    <w:p>
-      <w:pPr>
-        <w:pStyle w:val="Heading3"/>
-        <w:rPr>
-          <w:sz w:val="28"/>
-          <w:szCs w:val="28"/>
-        </w:rPr>
-      </w:pPr>
-      <w:bookmarkStart w:id="80" w:name="_Toc223433068"/>
-      <w:r>
-        <w:rPr>
-          <w:sz w:val="28"/>
-          <w:szCs w:val="28"/>
-        </w:rPr>
-        <w:t>Câu 4: Các thông tin cần thiết:</w:t>
-      </w:r>
-      <w:bookmarkEnd w:id="80"/>
-    </w:p>
-    <w:p>
-      <w:pPr>
-        <w:pStyle w:val="Heading3"/>
-        <w:numPr>
-          <w:ilvl w:val="2"/>
-          <w:numId w:val="4"/>
-        </w:numPr>
-        <w:spacing w:before="184"/>
-        <w:rPr>
-          <w:spacing w:val="-4"/>
-          <w:sz w:val="28"/>
-          <w:szCs w:val="28"/>
-        </w:rPr>
-      </w:pPr>
-      <w:bookmarkStart w:id="81" w:name="_Toc223433069"/>
-      <w:r>
-        <w:rPr>
-          <w:spacing w:val="-4"/>
-          <w:sz w:val="28"/>
-          <w:szCs w:val="28"/>
-          <w:u w:val="single"/>
-        </w:rPr>
-        <w:t>Nhà hàng Karaoke:</w:t>
-      </w:r>
-      <w:bookmarkEnd w:id="81"/>
+        <w:t xml:space="preserve"> Giao diện chi tiết hiện lên với danh sách các hóa đơn đã được thanh toán trong khung giờ đó được hiển thị dưới dạng bảng, với mỗi dòng tương ứng với một hóa đơn: Mã hóa đơn, Tên khách hàng, Ngày giờ, Tổng tiền.</w:t>
+      </w:r>
+      <w:bookmarkEnd w:id="77"/>
     </w:p>
     <w:p>
       <w:pPr>
@@ -25921,20 +26017,106 @@
         <w:ind w:left="1418" w:hanging="425"/>
         <w:rPr>
           <w:spacing w:val="-4"/>
+          <w:u w:val="single"/>
+        </w:rPr>
+      </w:pPr>
+      <w:bookmarkStart w:id="78" w:name="_Toc223433067"/>
+      <w:r>
+        <w:rPr>
+          <w:b w:val="0"/>
+          <w:bCs w:val="0"/>
+          <w:spacing w:val="-4"/>
+        </w:rPr>
+        <w:t xml:space="preserve">Quản lí click vào nút Quay lại trên giao diện hiện tại </w:t>
+      </w:r>
+      <w:r>
+        <w:rPr>
+          <w:b w:val="0"/>
+          <w:bCs w:val="0"/>
+          <w:spacing w:val="-4"/>
+        </w:rPr>
+        <w:t>→</w:t>
+      </w:r>
+      <w:r>
+        <w:rPr>
+          <w:b w:val="0"/>
+          <w:bCs w:val="0"/>
+          <w:spacing w:val="-4"/>
+        </w:rPr>
+        <w:t xml:space="preserve"> Hệ thống đóng bảng chi tiết và trở về lại giao diện danh sách Thống kê khung giờ theo lượt khách </w:t>
+      </w:r>
+      <w:r>
+        <w:rPr>
+          <w:b w:val="0"/>
+          <w:bCs w:val="0"/>
+          <w:spacing w:val="-4"/>
+        </w:rPr>
+        <w:t>→</w:t>
+      </w:r>
+      <w:r>
+        <w:rPr>
+          <w:b w:val="0"/>
+          <w:bCs w:val="0"/>
+          <w:spacing w:val="-4"/>
+        </w:rPr>
+        <w:t xml:space="preserve"> Quản lí tiếp tục thao tác.</w:t>
+      </w:r>
+      <w:bookmarkEnd w:id="78"/>
+    </w:p>
+    <w:p>
+      <w:pPr>
+        <w:pStyle w:val="Heading3"/>
+        <w:spacing w:before="184"/>
+        <w:ind w:left="1418"/>
+        <w:rPr>
+          <w:spacing w:val="-4"/>
+          <w:u w:val="single"/>
+        </w:rPr>
+      </w:pPr>
+    </w:p>
+    <w:p>
+      <w:pPr>
+        <w:pStyle w:val="Heading3"/>
+        <w:rPr>
           <w:sz w:val="28"/>
           <w:szCs w:val="28"/>
         </w:rPr>
       </w:pPr>
-      <w:bookmarkStart w:id="82" w:name="_Toc223433070"/>
-      <w:r>
-        <w:rPr>
-          <w:b w:val="0"/>
-          <w:bCs w:val="0"/>
-          <w:spacing w:val="-4"/>
-        </w:rPr>
-        <w:t>Tên quán.</w:t>
-      </w:r>
-      <w:bookmarkEnd w:id="82"/>
+      <w:bookmarkStart w:id="79" w:name="_Toc223433068"/>
+      <w:r>
+        <w:rPr>
+          <w:sz w:val="28"/>
+          <w:szCs w:val="28"/>
+        </w:rPr>
+        <w:t>Câu 4: Các thông tin cần thiết:</w:t>
+      </w:r>
+      <w:bookmarkEnd w:id="79"/>
+    </w:p>
+    <w:p>
+      <w:pPr>
+        <w:pStyle w:val="Heading3"/>
+        <w:numPr>
+          <w:ilvl w:val="2"/>
+          <w:numId w:val="4"/>
+        </w:numPr>
+        <w:spacing w:before="184"/>
+        <w:rPr>
+          <w:spacing w:val="-4"/>
+          <w:sz w:val="28"/>
+          <w:szCs w:val="28"/>
+        </w:rPr>
+      </w:pPr>
+      <w:bookmarkStart w:id="80" w:name="_Toc223433069"/>
+      <w:r>
+        <w:rPr>
+          <w:spacing w:val="-4"/>
+          <w:sz w:val="28"/>
+          <w:szCs w:val="28"/>
+          <w:u w:val="single"/>
+        </w:rPr>
+        <w:t>Nhà hàng Karaoke:</w:t>
+      </w:r>
+      <w:bookmarkEnd w:id="80"/>
     </w:p>
     <w:p>
       <w:pPr>
@@ -25951,16 +26133,16 @@
           <w:szCs w:val="28"/>
         </w:rPr>
       </w:pPr>
-      <w:bookmarkStart w:id="83" w:name="_Toc223433071"/>
-      <w:r>
-        <w:rPr>
-          <w:b w:val="0"/>
-          <w:bCs w:val="0"/>
-          <w:spacing w:val="-4"/>
-        </w:rPr>
-        <w:t>Địa chỉ.</w:t>
-      </w:r>
-      <w:bookmarkEnd w:id="83"/>
+      <w:bookmarkStart w:id="81" w:name="_Toc223433070"/>
+      <w:r>
+        <w:rPr>
+          <w:b w:val="0"/>
+          <w:bCs w:val="0"/>
+          <w:spacing w:val="-4"/>
+        </w:rPr>
+        <w:t>Tên quán.</w:t>
+      </w:r>
+      <w:bookmarkEnd w:id="81"/>
     </w:p>
     <w:p>
       <w:pPr>
@@ -25977,16 +26159,16 @@
           <w:szCs w:val="28"/>
         </w:rPr>
       </w:pPr>
-      <w:bookmarkStart w:id="84" w:name="_Toc223433072"/>
-      <w:r>
-        <w:rPr>
-          <w:b w:val="0"/>
-          <w:bCs w:val="0"/>
-          <w:spacing w:val="-4"/>
-        </w:rPr>
-        <w:t>Đánh giá bằng sao (Từ 0 đến 5 sao).</w:t>
-      </w:r>
-      <w:bookmarkEnd w:id="84"/>
+      <w:bookmarkStart w:id="82" w:name="_Toc223433071"/>
+      <w:r>
+        <w:rPr>
+          <w:b w:val="0"/>
+          <w:bCs w:val="0"/>
+          <w:spacing w:val="-4"/>
+        </w:rPr>
+        <w:t>Địa chỉ.</w:t>
+      </w:r>
+      <w:bookmarkEnd w:id="82"/>
     </w:p>
     <w:p>
       <w:pPr>
@@ -26003,7 +26185,33 @@
           <w:szCs w:val="28"/>
         </w:rPr>
       </w:pPr>
-      <w:bookmarkStart w:id="85" w:name="_Toc223433073"/>
+      <w:bookmarkStart w:id="83" w:name="_Toc223433072"/>
+      <w:r>
+        <w:rPr>
+          <w:b w:val="0"/>
+          <w:bCs w:val="0"/>
+          <w:spacing w:val="-4"/>
+        </w:rPr>
+        <w:t>Đánh giá bằng sao (Từ 0 đến 5 sao).</w:t>
+      </w:r>
+      <w:bookmarkEnd w:id="83"/>
+    </w:p>
+    <w:p>
+      <w:pPr>
+        <w:pStyle w:val="Heading3"/>
+        <w:numPr>
+          <w:ilvl w:val="3"/>
+          <w:numId w:val="4"/>
+        </w:numPr>
+        <w:spacing w:before="184"/>
+        <w:ind w:left="1418" w:hanging="425"/>
+        <w:rPr>
+          <w:spacing w:val="-4"/>
+          <w:sz w:val="28"/>
+          <w:szCs w:val="28"/>
+        </w:rPr>
+      </w:pPr>
+      <w:bookmarkStart w:id="84" w:name="_Toc223433073"/>
       <w:r>
         <w:rPr>
           <w:b w:val="0"/>
@@ -26028,7 +26236,7 @@
         </w:rPr>
         <w:t xml:space="preserve"> ảnh / video / văn bản).</w:t>
       </w:r>
-      <w:bookmarkEnd w:id="85"/>
+      <w:bookmarkEnd w:id="84"/>
     </w:p>
     <w:p>
       <w:pPr>
@@ -26043,7 +26251,7 @@
           <w:u w:val="single"/>
         </w:rPr>
       </w:pPr>
-      <w:bookmarkStart w:id="86" w:name="_Toc223433074"/>
+      <w:bookmarkStart w:id="85" w:name="_Toc223433074"/>
       <w:r>
         <w:rPr>
           <w:spacing w:val="-4"/>
@@ -26051,7 +26259,7 @@
         </w:rPr>
         <w:t>Phòng hát:</w:t>
       </w:r>
-      <w:bookmarkEnd w:id="86"/>
+      <w:bookmarkEnd w:id="85"/>
     </w:p>
     <w:p>
       <w:pPr>
@@ -26066,7 +26274,7 @@
           <w:spacing w:val="-4"/>
         </w:rPr>
       </w:pPr>
-      <w:bookmarkStart w:id="87" w:name="_Toc223433075"/>
+      <w:bookmarkStart w:id="86" w:name="_Toc223433075"/>
       <w:r>
         <w:rPr>
           <w:b w:val="0"/>
@@ -26083,7 +26291,7 @@
         </w:rPr>
         <w:t xml:space="preserve"> (số phòng).</w:t>
       </w:r>
-      <w:bookmarkEnd w:id="87"/>
+      <w:bookmarkEnd w:id="86"/>
     </w:p>
     <w:p>
       <w:pPr>
@@ -26098,7 +26306,7 @@
           <w:spacing w:val="-4"/>
         </w:rPr>
       </w:pPr>
-      <w:bookmarkStart w:id="88" w:name="_Toc223433076"/>
+      <w:bookmarkStart w:id="87" w:name="_Toc223433076"/>
       <w:r>
         <w:rPr>
           <w:b w:val="0"/>
@@ -26115,7 +26323,7 @@
         </w:rPr>
         <w:t>cỡ.</w:t>
       </w:r>
-      <w:bookmarkEnd w:id="88"/>
+      <w:bookmarkEnd w:id="87"/>
     </w:p>
     <w:p>
       <w:pPr>
@@ -26130,7 +26338,7 @@
           <w:spacing w:val="-4"/>
         </w:rPr>
       </w:pPr>
-      <w:bookmarkStart w:id="89" w:name="_Toc223433077"/>
+      <w:bookmarkStart w:id="88" w:name="_Toc223433077"/>
       <w:r>
         <w:rPr>
           <w:b w:val="0"/>
@@ -26163,7 +26371,7 @@
         </w:rPr>
         <w:t>.</w:t>
       </w:r>
-      <w:bookmarkEnd w:id="89"/>
+      <w:bookmarkEnd w:id="88"/>
     </w:p>
     <w:p>
       <w:pPr>
@@ -26178,7 +26386,7 @@
           <w:spacing w:val="-4"/>
         </w:rPr>
       </w:pPr>
-      <w:bookmarkStart w:id="90" w:name="_Toc223433078"/>
+      <w:bookmarkStart w:id="89" w:name="_Toc223433078"/>
       <w:r>
         <w:rPr>
           <w:b w:val="0"/>
@@ -26195,7 +26403,7 @@
         </w:rPr>
         <w:t>giờ.</w:t>
       </w:r>
-      <w:bookmarkEnd w:id="90"/>
+      <w:bookmarkEnd w:id="89"/>
     </w:p>
     <w:p>
       <w:pPr>
@@ -26210,7 +26418,7 @@
           <w:spacing w:val="-4"/>
         </w:rPr>
       </w:pPr>
-      <w:bookmarkStart w:id="91" w:name="_Toc223433079"/>
+      <w:bookmarkStart w:id="90" w:name="_Toc223433079"/>
       <w:r>
         <w:rPr>
           <w:b w:val="0"/>
@@ -26259,7 +26467,7 @@
         </w:rPr>
         <w:t>.</w:t>
       </w:r>
-      <w:bookmarkEnd w:id="91"/>
+      <w:bookmarkEnd w:id="90"/>
     </w:p>
     <w:p>
       <w:pPr>
@@ -26274,7 +26482,7 @@
           <w:u w:val="single"/>
         </w:rPr>
       </w:pPr>
-      <w:bookmarkStart w:id="92" w:name="_Toc223433080"/>
+      <w:bookmarkStart w:id="91" w:name="_Toc223433080"/>
       <w:r>
         <w:rPr>
           <w:spacing w:val="-4"/>
@@ -26282,7 +26490,7 @@
         </w:rPr>
         <w:t>Nhân viên:</w:t>
       </w:r>
-      <w:bookmarkEnd w:id="92"/>
+      <w:bookmarkEnd w:id="91"/>
       <w:r>
         <w:rPr>
           <w:spacing w:val="-4"/>
@@ -26304,7 +26512,7 @@
           <w:spacing w:val="-4"/>
         </w:rPr>
       </w:pPr>
-      <w:bookmarkStart w:id="93" w:name="_Toc223433081"/>
+      <w:bookmarkStart w:id="92" w:name="_Toc223433081"/>
       <w:r>
         <w:rPr>
           <w:b w:val="0"/>
@@ -26313,7 +26521,7 @@
         </w:rPr>
         <w:t>Mã nhân viên.</w:t>
       </w:r>
-      <w:bookmarkEnd w:id="93"/>
+      <w:bookmarkEnd w:id="92"/>
     </w:p>
     <w:p>
       <w:pPr>
@@ -26328,7 +26536,7 @@
           <w:spacing w:val="-4"/>
         </w:rPr>
       </w:pPr>
-      <w:bookmarkStart w:id="94" w:name="_Toc223433082"/>
+      <w:bookmarkStart w:id="93" w:name="_Toc223433082"/>
       <w:r>
         <w:rPr>
           <w:b w:val="0"/>
@@ -26337,7 +26545,7 @@
         </w:rPr>
         <w:t>Tên nhân viên.</w:t>
       </w:r>
-      <w:bookmarkEnd w:id="94"/>
+      <w:bookmarkEnd w:id="93"/>
     </w:p>
     <w:p>
       <w:pPr>
@@ -26352,7 +26560,7 @@
           <w:spacing w:val="-4"/>
         </w:rPr>
       </w:pPr>
-      <w:bookmarkStart w:id="95" w:name="_Toc223433083"/>
+      <w:bookmarkStart w:id="94" w:name="_Toc223433083"/>
       <w:r>
         <w:rPr>
           <w:b w:val="0"/>
@@ -26361,7 +26569,7 @@
         </w:rPr>
         <w:t>Số căn cước công dân.</w:t>
       </w:r>
-      <w:bookmarkEnd w:id="95"/>
+      <w:bookmarkEnd w:id="94"/>
     </w:p>
     <w:p>
       <w:pPr>
@@ -26376,7 +26584,7 @@
           <w:spacing w:val="-4"/>
         </w:rPr>
       </w:pPr>
-      <w:bookmarkStart w:id="96" w:name="_Toc223433084"/>
+      <w:bookmarkStart w:id="95" w:name="_Toc223433084"/>
       <w:r>
         <w:rPr>
           <w:b w:val="0"/>
@@ -26385,7 +26593,7 @@
         </w:rPr>
         <w:t>Số điện thoại.</w:t>
       </w:r>
-      <w:bookmarkEnd w:id="96"/>
+      <w:bookmarkEnd w:id="95"/>
     </w:p>
     <w:p>
       <w:pPr>
@@ -26400,7 +26608,7 @@
           <w:spacing w:val="-4"/>
         </w:rPr>
       </w:pPr>
-      <w:bookmarkStart w:id="97" w:name="_Toc223433085"/>
+      <w:bookmarkStart w:id="96" w:name="_Toc223433085"/>
       <w:r>
         <w:rPr>
           <w:b w:val="0"/>
@@ -26409,7 +26617,7 @@
         </w:rPr>
         <w:t>Email.</w:t>
       </w:r>
-      <w:bookmarkEnd w:id="97"/>
+      <w:bookmarkEnd w:id="96"/>
     </w:p>
     <w:p>
       <w:pPr>
@@ -26424,16 +26632,17 @@
           <w:spacing w:val="-4"/>
         </w:rPr>
       </w:pPr>
-      <w:bookmarkStart w:id="98" w:name="_Toc223433086"/>
-      <w:r>
-        <w:rPr>
-          <w:b w:val="0"/>
-          <w:bCs w:val="0"/>
-          <w:spacing w:val="-4"/>
-        </w:rPr>
+      <w:bookmarkStart w:id="97" w:name="_Toc223433086"/>
+      <w:r>
+        <w:rPr>
+          <w:b w:val="0"/>
+          <w:bCs w:val="0"/>
+          <w:spacing w:val="-4"/>
+        </w:rPr>
+        <w:lastRenderedPageBreak/>
         <w:t>Địa chỉ.</w:t>
       </w:r>
-      <w:bookmarkEnd w:id="98"/>
+      <w:bookmarkEnd w:id="97"/>
     </w:p>
     <w:p>
       <w:pPr>
@@ -26448,7 +26657,7 @@
           <w:spacing w:val="-4"/>
         </w:rPr>
       </w:pPr>
-      <w:bookmarkStart w:id="99" w:name="_Toc223433087"/>
+      <w:bookmarkStart w:id="98" w:name="_Toc223433087"/>
       <w:r>
         <w:rPr>
           <w:b w:val="0"/>
@@ -26457,7 +26666,7 @@
         </w:rPr>
         <w:t>Chức vụ.</w:t>
       </w:r>
-      <w:bookmarkEnd w:id="99"/>
+      <w:bookmarkEnd w:id="98"/>
     </w:p>
     <w:p>
       <w:pPr>
@@ -26472,7 +26681,7 @@
           <w:spacing w:val="-4"/>
         </w:rPr>
       </w:pPr>
-      <w:bookmarkStart w:id="100" w:name="_Toc223433088"/>
+      <w:bookmarkStart w:id="99" w:name="_Toc223433088"/>
       <w:r>
         <w:rPr>
           <w:b w:val="0"/>
@@ -26497,7 +26706,7 @@
         </w:rPr>
         <w:t xml:space="preserve"> cơ bản.</w:t>
       </w:r>
-      <w:bookmarkEnd w:id="100"/>
+      <w:bookmarkEnd w:id="99"/>
     </w:p>
     <w:p>
       <w:pPr>
@@ -26512,7 +26721,7 @@
           <w:spacing w:val="-4"/>
         </w:rPr>
       </w:pPr>
-      <w:bookmarkStart w:id="101" w:name="_Toc223433089"/>
+      <w:bookmarkStart w:id="100" w:name="_Toc223433089"/>
       <w:r>
         <w:rPr>
           <w:b w:val="0"/>
@@ -26521,7 +26730,7 @@
         </w:rPr>
         <w:t>Lương theo giờ.</w:t>
       </w:r>
-      <w:bookmarkEnd w:id="101"/>
+      <w:bookmarkEnd w:id="100"/>
     </w:p>
     <w:p>
       <w:pPr>
@@ -26536,7 +26745,7 @@
           <w:spacing w:val="-4"/>
         </w:rPr>
       </w:pPr>
-      <w:bookmarkStart w:id="102" w:name="_Toc223433090"/>
+      <w:bookmarkStart w:id="101" w:name="_Toc223433090"/>
       <w:r>
         <w:rPr>
           <w:b w:val="0"/>
@@ -26545,7 +26754,7 @@
         </w:rPr>
         <w:t>Trạng thái làm việc.</w:t>
       </w:r>
-      <w:bookmarkEnd w:id="102"/>
+      <w:bookmarkEnd w:id="101"/>
     </w:p>
     <w:p>
       <w:pPr>
@@ -26560,7 +26769,7 @@
           <w:u w:val="single"/>
         </w:rPr>
       </w:pPr>
-      <w:bookmarkStart w:id="103" w:name="_Toc223433091"/>
+      <w:bookmarkStart w:id="102" w:name="_Toc223433091"/>
       <w:r>
         <w:rPr>
           <w:spacing w:val="-4"/>
@@ -26568,7 +26777,7 @@
         </w:rPr>
         <w:t>Mặt hàng:</w:t>
       </w:r>
-      <w:bookmarkEnd w:id="103"/>
+      <w:bookmarkEnd w:id="102"/>
     </w:p>
     <w:p>
       <w:pPr>
@@ -26583,17 +26792,16 @@
           <w:spacing w:val="-4"/>
         </w:rPr>
       </w:pPr>
-      <w:bookmarkStart w:id="104" w:name="_Toc223433092"/>
-      <w:r>
-        <w:rPr>
-          <w:b w:val="0"/>
-          <w:bCs w:val="0"/>
-          <w:spacing w:val="-4"/>
-        </w:rPr>
-        <w:lastRenderedPageBreak/>
+      <w:bookmarkStart w:id="103" w:name="_Toc223433092"/>
+      <w:r>
+        <w:rPr>
+          <w:b w:val="0"/>
+          <w:bCs w:val="0"/>
+          <w:spacing w:val="-4"/>
+        </w:rPr>
         <w:t>Mã mặt hàng.</w:t>
       </w:r>
-      <w:bookmarkEnd w:id="104"/>
+      <w:bookmarkEnd w:id="103"/>
     </w:p>
     <w:p>
       <w:pPr>
@@ -26608,7 +26816,7 @@
           <w:spacing w:val="-4"/>
         </w:rPr>
       </w:pPr>
-      <w:bookmarkStart w:id="105" w:name="_Toc223433093"/>
+      <w:bookmarkStart w:id="104" w:name="_Toc223433093"/>
       <w:r>
         <w:rPr>
           <w:b w:val="0"/>
@@ -26617,7 +26825,7 @@
         </w:rPr>
         <w:t>Tên hàng.</w:t>
       </w:r>
-      <w:bookmarkEnd w:id="105"/>
+      <w:bookmarkEnd w:id="104"/>
     </w:p>
     <w:p>
       <w:pPr>
@@ -26632,7 +26840,7 @@
           <w:spacing w:val="-4"/>
         </w:rPr>
       </w:pPr>
-      <w:bookmarkStart w:id="106" w:name="_Toc223433094"/>
+      <w:bookmarkStart w:id="105" w:name="_Toc223433094"/>
       <w:r>
         <w:rPr>
           <w:b w:val="0"/>
@@ -26641,7 +26849,7 @@
         </w:rPr>
         <w:t>Đơn giá.</w:t>
       </w:r>
-      <w:bookmarkEnd w:id="106"/>
+      <w:bookmarkEnd w:id="105"/>
     </w:p>
     <w:p>
       <w:pPr>
@@ -26656,7 +26864,7 @@
           <w:spacing w:val="-4"/>
         </w:rPr>
       </w:pPr>
-      <w:bookmarkStart w:id="107" w:name="_Toc223433095"/>
+      <w:bookmarkStart w:id="106" w:name="_Toc223433095"/>
       <w:r>
         <w:rPr>
           <w:b w:val="0"/>
@@ -26665,7 +26873,7 @@
         </w:rPr>
         <w:t>Số lượng còn lại trong kho.</w:t>
       </w:r>
-      <w:bookmarkEnd w:id="107"/>
+      <w:bookmarkEnd w:id="106"/>
     </w:p>
     <w:p>
       <w:pPr>
@@ -26679,14 +26887,14 @@
           <w:u w:val="single"/>
         </w:rPr>
       </w:pPr>
-      <w:bookmarkStart w:id="108" w:name="_Toc223433096"/>
+      <w:bookmarkStart w:id="107" w:name="_Toc223433096"/>
       <w:r>
         <w:rPr>
           <w:u w:val="single"/>
         </w:rPr>
         <w:t>Ca làm việc:</w:t>
       </w:r>
-      <w:bookmarkEnd w:id="108"/>
+      <w:bookmarkEnd w:id="107"/>
     </w:p>
     <w:p>
       <w:pPr>
@@ -26698,7 +26906,7 @@
         <w:spacing w:before="184"/>
         <w:ind w:left="1418" w:hanging="284"/>
       </w:pPr>
-      <w:bookmarkStart w:id="109" w:name="_Toc223433097"/>
+      <w:bookmarkStart w:id="108" w:name="_Toc223433097"/>
       <w:r>
         <w:rPr>
           <w:b w:val="0"/>
@@ -26714,7 +26922,7 @@
         </w:rPr>
         <w:t xml:space="preserve"> ca làm việc.</w:t>
       </w:r>
-      <w:bookmarkEnd w:id="109"/>
+      <w:bookmarkEnd w:id="108"/>
     </w:p>
     <w:p>
       <w:pPr>
@@ -26726,7 +26934,7 @@
         <w:spacing w:before="184"/>
         <w:ind w:left="1418" w:hanging="284"/>
       </w:pPr>
-      <w:bookmarkStart w:id="110" w:name="_Toc223433098"/>
+      <w:bookmarkStart w:id="109" w:name="_Toc223433098"/>
       <w:r>
         <w:rPr>
           <w:b w:val="0"/>
@@ -26734,7 +26942,7 @@
         </w:rPr>
         <w:t>Giờ bắt đầu.</w:t>
       </w:r>
-      <w:bookmarkEnd w:id="110"/>
+      <w:bookmarkEnd w:id="109"/>
     </w:p>
     <w:p>
       <w:pPr>
@@ -26746,7 +26954,7 @@
         <w:spacing w:before="184"/>
         <w:ind w:left="1418" w:hanging="284"/>
       </w:pPr>
-      <w:bookmarkStart w:id="111" w:name="_Toc223433099"/>
+      <w:bookmarkStart w:id="110" w:name="_Toc223433099"/>
       <w:r>
         <w:rPr>
           <w:b w:val="0"/>
@@ -26754,7 +26962,7 @@
         </w:rPr>
         <w:t>Giờ kết thúc.</w:t>
       </w:r>
-      <w:bookmarkEnd w:id="111"/>
+      <w:bookmarkEnd w:id="110"/>
     </w:p>
     <w:p>
       <w:pPr>
@@ -26769,7 +26977,7 @@
           <w:u w:val="single"/>
         </w:rPr>
       </w:pPr>
-      <w:bookmarkStart w:id="112" w:name="_Toc223433100"/>
+      <w:bookmarkStart w:id="111" w:name="_Toc223433100"/>
       <w:r>
         <w:rPr>
           <w:spacing w:val="-4"/>
@@ -26777,7 +26985,7 @@
         </w:rPr>
         <w:t>Khách hàng:</w:t>
       </w:r>
-      <w:bookmarkEnd w:id="112"/>
+      <w:bookmarkEnd w:id="111"/>
     </w:p>
     <w:p>
       <w:pPr>
@@ -26792,7 +27000,7 @@
           <w:spacing w:val="-4"/>
         </w:rPr>
       </w:pPr>
-      <w:bookmarkStart w:id="113" w:name="_Toc223433101"/>
+      <w:bookmarkStart w:id="112" w:name="_Toc223433101"/>
       <w:r>
         <w:rPr>
           <w:b w:val="0"/>
@@ -26800,7 +27008,7 @@
         </w:rPr>
         <w:t>Tên khách hàng.</w:t>
       </w:r>
-      <w:bookmarkEnd w:id="113"/>
+      <w:bookmarkEnd w:id="112"/>
     </w:p>
     <w:p>
       <w:pPr>
@@ -26815,7 +27023,7 @@
           <w:spacing w:val="-4"/>
         </w:rPr>
       </w:pPr>
-      <w:bookmarkStart w:id="114" w:name="_Toc223433102"/>
+      <w:bookmarkStart w:id="113" w:name="_Toc223433102"/>
       <w:r>
         <w:rPr>
           <w:b w:val="0"/>
@@ -26823,7 +27031,7 @@
         </w:rPr>
         <w:t>Địa chỉ.</w:t>
       </w:r>
-      <w:bookmarkEnd w:id="114"/>
+      <w:bookmarkEnd w:id="113"/>
     </w:p>
     <w:p>
       <w:pPr>
@@ -26838,7 +27046,7 @@
           <w:spacing w:val="-4"/>
         </w:rPr>
       </w:pPr>
-      <w:bookmarkStart w:id="115" w:name="_Toc223433103"/>
+      <w:bookmarkStart w:id="114" w:name="_Toc223433103"/>
       <w:r>
         <w:rPr>
           <w:b w:val="0"/>
@@ -26846,7 +27054,7 @@
         </w:rPr>
         <w:t>Số điện thoại.</w:t>
       </w:r>
-      <w:bookmarkEnd w:id="115"/>
+      <w:bookmarkEnd w:id="114"/>
     </w:p>
     <w:p>
       <w:pPr>
@@ -26861,7 +27069,7 @@
           <w:spacing w:val="-4"/>
         </w:rPr>
       </w:pPr>
-      <w:bookmarkStart w:id="116" w:name="_Toc223433104"/>
+      <w:bookmarkStart w:id="115" w:name="_Toc223433104"/>
       <w:r>
         <w:rPr>
           <w:b w:val="0"/>
@@ -26869,7 +27077,7 @@
         </w:rPr>
         <w:t>Email.</w:t>
       </w:r>
-      <w:bookmarkEnd w:id="116"/>
+      <w:bookmarkEnd w:id="115"/>
     </w:p>
     <w:p>
       <w:pPr>
@@ -26884,7 +27092,7 @@
           <w:spacing w:val="-4"/>
         </w:rPr>
       </w:pPr>
-      <w:bookmarkStart w:id="117" w:name="_Toc223433105"/>
+      <w:bookmarkStart w:id="116" w:name="_Toc223433105"/>
       <w:r>
         <w:rPr>
           <w:b w:val="0"/>
@@ -26892,7 +27100,7 @@
         </w:rPr>
         <w:t>Ghi chú.</w:t>
       </w:r>
-      <w:bookmarkEnd w:id="117"/>
+      <w:bookmarkEnd w:id="116"/>
     </w:p>
     <w:p>
       <w:pPr>
@@ -26907,7 +27115,7 @@
           <w:u w:val="single"/>
         </w:rPr>
       </w:pPr>
-      <w:bookmarkStart w:id="118" w:name="_Toc223433106"/>
+      <w:bookmarkStart w:id="117" w:name="_Toc223433106"/>
       <w:r>
         <w:rPr>
           <w:u w:val="single"/>
@@ -26926,7 +27134,7 @@
         </w:rPr>
         <w:t>:</w:t>
       </w:r>
-      <w:bookmarkEnd w:id="118"/>
+      <w:bookmarkEnd w:id="117"/>
     </w:p>
     <w:p>
       <w:pPr>
@@ -26941,7 +27149,7 @@
           <w:spacing w:val="-4"/>
         </w:rPr>
       </w:pPr>
-      <w:bookmarkStart w:id="119" w:name="_Toc223433107"/>
+      <w:bookmarkStart w:id="118" w:name="_Toc223433107"/>
       <w:r>
         <w:rPr>
           <w:b w:val="0"/>
@@ -26963,7 +27171,7 @@
         </w:rPr>
         <w:t>.</w:t>
       </w:r>
-      <w:bookmarkEnd w:id="119"/>
+      <w:bookmarkEnd w:id="118"/>
     </w:p>
     <w:p>
       <w:pPr>
@@ -26978,7 +27186,7 @@
           <w:spacing w:val="-4"/>
         </w:rPr>
       </w:pPr>
-      <w:bookmarkStart w:id="120" w:name="_Toc223433108"/>
+      <w:bookmarkStart w:id="119" w:name="_Toc223433108"/>
       <w:r>
         <w:rPr>
           <w:b w:val="0"/>
@@ -27000,7 +27208,7 @@
         </w:rPr>
         <w:t>.</w:t>
       </w:r>
-      <w:bookmarkEnd w:id="120"/>
+      <w:bookmarkEnd w:id="119"/>
     </w:p>
     <w:p>
       <w:pPr>
@@ -27015,7 +27223,7 @@
           <w:spacing w:val="-4"/>
         </w:rPr>
       </w:pPr>
-      <w:bookmarkStart w:id="121" w:name="_Toc223433109"/>
+      <w:bookmarkStart w:id="120" w:name="_Toc223433109"/>
       <w:r>
         <w:rPr>
           <w:b w:val="0"/>
@@ -27023,7 +27231,7 @@
         </w:rPr>
         <w:t>Thời gian đặt phòng.</w:t>
       </w:r>
-      <w:bookmarkEnd w:id="121"/>
+      <w:bookmarkEnd w:id="120"/>
     </w:p>
     <w:p>
       <w:pPr>
@@ -27038,7 +27246,7 @@
           <w:spacing w:val="-4"/>
         </w:rPr>
       </w:pPr>
-      <w:bookmarkStart w:id="122" w:name="_Toc223433110"/>
+      <w:bookmarkStart w:id="121" w:name="_Toc223433110"/>
       <w:r>
         <w:rPr>
           <w:b w:val="0"/>
@@ -27046,7 +27254,7 @@
         </w:rPr>
         <w:t>Thời gian trả phòng (không bắt buộc, có thể cập nhật khi khách trả phòng).</w:t>
       </w:r>
-      <w:bookmarkEnd w:id="122"/>
+      <w:bookmarkEnd w:id="121"/>
     </w:p>
     <w:p>
       <w:pPr>
@@ -27061,7 +27269,7 @@
           <w:spacing w:val="-4"/>
         </w:rPr>
       </w:pPr>
-      <w:bookmarkStart w:id="123" w:name="_Toc223433111"/>
+      <w:bookmarkStart w:id="122" w:name="_Toc223433111"/>
       <w:r>
         <w:rPr>
           <w:b w:val="0"/>
@@ -27069,7 +27277,7 @@
         </w:rPr>
         <w:t>Ghi chú.</w:t>
       </w:r>
-      <w:bookmarkEnd w:id="123"/>
+      <w:bookmarkEnd w:id="122"/>
     </w:p>
     <w:p>
       <w:pPr>
@@ -27084,7 +27292,7 @@
           <w:u w:val="single"/>
         </w:rPr>
       </w:pPr>
-      <w:bookmarkStart w:id="124" w:name="_Toc223433112"/>
+      <w:bookmarkStart w:id="123" w:name="_Toc223433112"/>
       <w:r>
         <w:rPr>
           <w:spacing w:val="-4"/>
@@ -27092,7 +27300,7 @@
         </w:rPr>
         <w:t>Hóa đơn:</w:t>
       </w:r>
-      <w:bookmarkEnd w:id="124"/>
+      <w:bookmarkEnd w:id="123"/>
     </w:p>
     <w:p>
       <w:pPr>
@@ -27107,7 +27315,7 @@
           <w:spacing w:val="-4"/>
         </w:rPr>
       </w:pPr>
-      <w:bookmarkStart w:id="125" w:name="_Toc223433113"/>
+      <w:bookmarkStart w:id="124" w:name="_Toc223433113"/>
       <w:r>
         <w:rPr>
           <w:b w:val="0"/>
@@ -27116,7 +27324,7 @@
         </w:rPr>
         <w:t>Mã hóa đơn.</w:t>
       </w:r>
-      <w:bookmarkEnd w:id="125"/>
+      <w:bookmarkEnd w:id="124"/>
     </w:p>
     <w:p>
       <w:pPr>
@@ -27131,17 +27339,18 @@
           <w:spacing w:val="-4"/>
         </w:rPr>
       </w:pPr>
-      <w:bookmarkStart w:id="126" w:name="_Toc223433114"/>
-      <w:bookmarkStart w:id="127" w:name="_Toc223433117"/>
-      <w:r>
-        <w:rPr>
-          <w:b w:val="0"/>
-          <w:bCs w:val="0"/>
-          <w:spacing w:val="-4"/>
-        </w:rPr>
+      <w:bookmarkStart w:id="125" w:name="_Toc223433114"/>
+      <w:bookmarkStart w:id="126" w:name="_Toc223433117"/>
+      <w:r>
+        <w:rPr>
+          <w:b w:val="0"/>
+          <w:bCs w:val="0"/>
+          <w:spacing w:val="-4"/>
+        </w:rPr>
+        <w:lastRenderedPageBreak/>
         <w:t>Thông tin nhân viên tạo hóa đơn: Mã nhân viên, Tên nhân viên, Chức vụ.</w:t>
       </w:r>
-      <w:bookmarkEnd w:id="126"/>
+      <w:bookmarkEnd w:id="125"/>
     </w:p>
     <w:p>
       <w:pPr>
@@ -27156,7 +27365,7 @@
           <w:spacing w:val="-4"/>
         </w:rPr>
       </w:pPr>
-      <w:bookmarkStart w:id="128" w:name="_Toc223433115"/>
+      <w:bookmarkStart w:id="127" w:name="_Toc223433115"/>
       <w:r>
         <w:rPr>
           <w:b w:val="0"/>
@@ -27174,7 +27383,7 @@
         </w:rPr>
         <w:t xml:space="preserve"> tin đơn đặt phòng hát:</w:t>
       </w:r>
-      <w:bookmarkEnd w:id="128"/>
+      <w:bookmarkEnd w:id="127"/>
     </w:p>
     <w:p>
       <w:pPr>
@@ -27189,7 +27398,7 @@
           <w:spacing w:val="-4"/>
         </w:rPr>
       </w:pPr>
-      <w:bookmarkStart w:id="129" w:name="_Toc223433116"/>
+      <w:bookmarkStart w:id="128" w:name="_Toc223433116"/>
       <w:r>
         <w:rPr>
           <w:b w:val="0"/>
@@ -27200,7 +27409,7 @@
         </w:rPr>
         <w:t>Thông tin khách hàng: Tên khách hàng, Địa chỉ, Số điện thoại, Email.</w:t>
       </w:r>
-      <w:bookmarkEnd w:id="129"/>
+      <w:bookmarkEnd w:id="128"/>
     </w:p>
     <w:p>
       <w:pPr>
@@ -27235,7 +27444,7 @@
         </w:rPr>
         <w:t>hát: Tên phòng, Kích cỡ, Loại phòng, Giá phòng theo giờ.</w:t>
       </w:r>
-      <w:bookmarkEnd w:id="127"/>
+      <w:bookmarkEnd w:id="126"/>
     </w:p>
     <w:p>
       <w:pPr>
@@ -27250,7 +27459,7 @@
           <w:spacing w:val="-4"/>
         </w:rPr>
       </w:pPr>
-      <w:bookmarkStart w:id="130" w:name="_Toc223433118"/>
+      <w:bookmarkStart w:id="129" w:name="_Toc223433118"/>
       <w:r>
         <w:rPr>
           <w:b w:val="0"/>
@@ -27261,7 +27470,7 @@
         </w:rPr>
         <w:t>Thòi gian đặt phòng.</w:t>
       </w:r>
-      <w:bookmarkEnd w:id="130"/>
+      <w:bookmarkEnd w:id="129"/>
     </w:p>
     <w:p>
       <w:pPr>
@@ -27276,7 +27485,7 @@
           <w:spacing w:val="-4"/>
         </w:rPr>
       </w:pPr>
-      <w:bookmarkStart w:id="131" w:name="_Toc223433119"/>
+      <w:bookmarkStart w:id="130" w:name="_Toc223433119"/>
       <w:r>
         <w:rPr>
           <w:b w:val="0"/>
@@ -27285,7 +27494,6 @@
           <w:sz w:val="24"/>
           <w:szCs w:val="24"/>
         </w:rPr>
-        <w:lastRenderedPageBreak/>
         <w:t>Thời gian trả phòng</w:t>
       </w:r>
       <w:r>
@@ -27308,7 +27516,7 @@
         </w:rPr>
         <w:t xml:space="preserve"> cập nhật khi khách trả phòng).</w:t>
       </w:r>
-      <w:bookmarkEnd w:id="131"/>
+      <w:bookmarkEnd w:id="130"/>
     </w:p>
     <w:p>
       <w:pPr>
@@ -27323,7 +27531,7 @@
           <w:spacing w:val="-4"/>
         </w:rPr>
       </w:pPr>
-      <w:bookmarkStart w:id="132" w:name="_Toc223433120"/>
+      <w:bookmarkStart w:id="131" w:name="_Toc223433120"/>
       <w:r>
         <w:rPr>
           <w:b w:val="0"/>
@@ -27332,7 +27540,7 @@
         </w:rPr>
         <w:t>Thành tiền phòng.</w:t>
       </w:r>
-      <w:bookmarkEnd w:id="132"/>
+      <w:bookmarkEnd w:id="131"/>
     </w:p>
     <w:p>
       <w:pPr>
@@ -27347,7 +27555,7 @@
           <w:spacing w:val="-4"/>
         </w:rPr>
       </w:pPr>
-      <w:bookmarkStart w:id="133" w:name="_Toc223433121"/>
+      <w:bookmarkStart w:id="132" w:name="_Toc223433121"/>
       <w:r>
         <w:rPr>
           <w:b w:val="0"/>
@@ -27364,7 +27572,7 @@
         </w:rPr>
         <w:t xml:space="preserve"> Mã mặt hàng, Tên mặt hàng, Số lượng, Đơn giá, Thành tiền.</w:t>
       </w:r>
-      <w:bookmarkEnd w:id="133"/>
+      <w:bookmarkEnd w:id="132"/>
     </w:p>
     <w:p>
       <w:pPr>
@@ -27379,7 +27587,7 @@
           <w:spacing w:val="-4"/>
         </w:rPr>
       </w:pPr>
-      <w:bookmarkStart w:id="134" w:name="_Toc223433122"/>
+      <w:bookmarkStart w:id="133" w:name="_Toc223433122"/>
       <w:r>
         <w:rPr>
           <w:b w:val="0"/>
@@ -27388,7 +27596,7 @@
         </w:rPr>
         <w:t>Tổng tiền thanh toán.</w:t>
       </w:r>
-      <w:bookmarkEnd w:id="134"/>
+      <w:bookmarkEnd w:id="133"/>
     </w:p>
     <w:p>
       <w:pPr>
@@ -27403,7 +27611,7 @@
           <w:spacing w:val="-4"/>
         </w:rPr>
       </w:pPr>
-      <w:bookmarkStart w:id="135" w:name="_Toc223433123"/>
+      <w:bookmarkStart w:id="134" w:name="_Toc223433123"/>
       <w:r>
         <w:rPr>
           <w:b w:val="0"/>
@@ -27412,7 +27620,7 @@
         </w:rPr>
         <w:t>Trạng thái thanh toán.</w:t>
       </w:r>
-      <w:bookmarkEnd w:id="135"/>
+      <w:bookmarkEnd w:id="134"/>
     </w:p>
     <w:p>
       <w:pPr>
@@ -27427,7 +27635,7 @@
           <w:spacing w:val="-4"/>
         </w:rPr>
       </w:pPr>
-      <w:bookmarkStart w:id="136" w:name="_Toc223433124"/>
+      <w:bookmarkStart w:id="135" w:name="_Toc223433124"/>
       <w:r>
         <w:rPr>
           <w:b w:val="0"/>
@@ -27436,7 +27644,7 @@
         </w:rPr>
         <w:t>Phương thức thanh toán.</w:t>
       </w:r>
-      <w:bookmarkEnd w:id="136"/>
+      <w:bookmarkEnd w:id="135"/>
     </w:p>
     <w:p>
       <w:pPr>
@@ -27450,7 +27658,7 @@
           <w:spacing w:val="-4"/>
         </w:rPr>
       </w:pPr>
-      <w:bookmarkStart w:id="137" w:name="_Toc223433125"/>
+      <w:bookmarkStart w:id="136" w:name="_Toc223433125"/>
       <w:r>
         <w:rPr>
           <w:spacing w:val="-4"/>
@@ -27458,7 +27666,7 @@
         </w:rPr>
         <w:t>Khoản phạt:</w:t>
       </w:r>
-      <w:bookmarkEnd w:id="137"/>
+      <w:bookmarkEnd w:id="136"/>
     </w:p>
     <w:p>
       <w:pPr>
@@ -27473,7 +27681,7 @@
           <w:spacing w:val="-4"/>
         </w:rPr>
       </w:pPr>
-      <w:bookmarkStart w:id="138" w:name="_Toc223433126"/>
+      <w:bookmarkStart w:id="137" w:name="_Toc223433126"/>
       <w:r>
         <w:rPr>
           <w:b w:val="0"/>
@@ -27481,7 +27689,7 @@
         </w:rPr>
         <w:t>Mã khoản phạt.</w:t>
       </w:r>
-      <w:bookmarkEnd w:id="138"/>
+      <w:bookmarkEnd w:id="137"/>
     </w:p>
     <w:p>
       <w:pPr>
@@ -27496,7 +27704,7 @@
           <w:spacing w:val="-4"/>
         </w:rPr>
       </w:pPr>
-      <w:bookmarkStart w:id="139" w:name="_Toc223433127"/>
+      <w:bookmarkStart w:id="138" w:name="_Toc223433127"/>
       <w:r>
         <w:rPr>
           <w:b w:val="0"/>
@@ -27504,7 +27712,7 @@
         </w:rPr>
         <w:t>Thông tin nhân viên: Mã nhân viên, Tên nhân viên.</w:t>
       </w:r>
-      <w:bookmarkEnd w:id="139"/>
+      <w:bookmarkEnd w:id="138"/>
     </w:p>
     <w:p>
       <w:pPr>
@@ -27519,7 +27727,7 @@
           <w:spacing w:val="-4"/>
         </w:rPr>
       </w:pPr>
-      <w:bookmarkStart w:id="140" w:name="_Toc223433128"/>
+      <w:bookmarkStart w:id="139" w:name="_Toc223433128"/>
       <w:r>
         <w:rPr>
           <w:b w:val="0"/>
@@ -27527,7 +27735,7 @@
         </w:rPr>
         <w:t>Ngày bị phạt.</w:t>
       </w:r>
-      <w:bookmarkEnd w:id="140"/>
+      <w:bookmarkEnd w:id="139"/>
     </w:p>
     <w:p>
       <w:pPr>
@@ -27542,7 +27750,7 @@
           <w:spacing w:val="-4"/>
         </w:rPr>
       </w:pPr>
-      <w:bookmarkStart w:id="141" w:name="_Toc223433129"/>
+      <w:bookmarkStart w:id="140" w:name="_Toc223433129"/>
       <w:r>
         <w:rPr>
           <w:b w:val="0"/>
@@ -27550,7 +27758,7 @@
         </w:rPr>
         <w:t>Lý do.</w:t>
       </w:r>
-      <w:bookmarkEnd w:id="141"/>
+      <w:bookmarkEnd w:id="140"/>
     </w:p>
     <w:p>
       <w:pPr>
@@ -27565,7 +27773,7 @@
           <w:spacing w:val="-4"/>
         </w:rPr>
       </w:pPr>
-      <w:bookmarkStart w:id="142" w:name="_Toc223433130"/>
+      <w:bookmarkStart w:id="141" w:name="_Toc223433130"/>
       <w:r>
         <w:rPr>
           <w:b w:val="0"/>
@@ -27573,7 +27781,7 @@
         </w:rPr>
         <w:t>Số tiền phạt.</w:t>
       </w:r>
-      <w:bookmarkEnd w:id="142"/>
+      <w:bookmarkEnd w:id="141"/>
     </w:p>
     <w:p>
       <w:pPr>
@@ -27588,7 +27796,7 @@
           <w:spacing w:val="-4"/>
         </w:rPr>
       </w:pPr>
-      <w:bookmarkStart w:id="143" w:name="_Toc223433131"/>
+      <w:bookmarkStart w:id="142" w:name="_Toc223433131"/>
       <w:r>
         <w:rPr>
           <w:b w:val="0"/>
@@ -27596,7 +27804,7 @@
         </w:rPr>
         <w:t>Ghi chú.</w:t>
       </w:r>
-      <w:bookmarkEnd w:id="143"/>
+      <w:bookmarkEnd w:id="142"/>
     </w:p>
     <w:p>
       <w:pPr>
@@ -27610,7 +27818,7 @@
           <w:spacing w:val="-4"/>
         </w:rPr>
       </w:pPr>
-      <w:bookmarkStart w:id="144" w:name="_Toc223433132"/>
+      <w:bookmarkStart w:id="143" w:name="_Toc223433132"/>
       <w:r>
         <w:rPr>
           <w:spacing w:val="-4"/>
@@ -27618,7 +27826,7 @@
         </w:rPr>
         <w:t>Thống kê hóa đơn theo khung giờ:</w:t>
       </w:r>
-      <w:bookmarkEnd w:id="144"/>
+      <w:bookmarkEnd w:id="143"/>
     </w:p>
     <w:p>
       <w:pPr>
@@ -27633,7 +27841,7 @@
           <w:spacing w:val="-4"/>
         </w:rPr>
       </w:pPr>
-      <w:bookmarkStart w:id="145" w:name="_Toc223433133"/>
+      <w:bookmarkStart w:id="144" w:name="_Toc223433133"/>
       <w:r>
         <w:rPr>
           <w:b w:val="0"/>
@@ -27642,7 +27850,7 @@
         </w:rPr>
         <w:t>Mã hóa đơn.</w:t>
       </w:r>
-      <w:bookmarkEnd w:id="145"/>
+      <w:bookmarkEnd w:id="144"/>
     </w:p>
     <w:p>
       <w:pPr>
@@ -27657,7 +27865,7 @@
           <w:spacing w:val="-4"/>
         </w:rPr>
       </w:pPr>
-      <w:bookmarkStart w:id="146" w:name="_Toc223433134"/>
+      <w:bookmarkStart w:id="145" w:name="_Toc223433134"/>
       <w:r>
         <w:rPr>
           <w:b w:val="0"/>
@@ -27666,7 +27874,7 @@
         </w:rPr>
         <w:t>Tên khách hàng.</w:t>
       </w:r>
-      <w:bookmarkEnd w:id="146"/>
+      <w:bookmarkEnd w:id="145"/>
     </w:p>
     <w:p>
       <w:pPr>
@@ -27681,7 +27889,7 @@
           <w:spacing w:val="-4"/>
         </w:rPr>
       </w:pPr>
-      <w:bookmarkStart w:id="147" w:name="_Toc223433135"/>
+      <w:bookmarkStart w:id="146" w:name="_Toc223433135"/>
       <w:r>
         <w:rPr>
           <w:b w:val="0"/>
@@ -27690,7 +27898,7 @@
         </w:rPr>
         <w:t>Ngày giờ.</w:t>
       </w:r>
-      <w:bookmarkEnd w:id="147"/>
+      <w:bookmarkEnd w:id="146"/>
     </w:p>
     <w:p>
       <w:pPr>
@@ -27705,7 +27913,7 @@
           <w:spacing w:val="-4"/>
         </w:rPr>
       </w:pPr>
-      <w:bookmarkStart w:id="148" w:name="_Toc223433136"/>
+      <w:bookmarkStart w:id="147" w:name="_Toc223433136"/>
       <w:r>
         <w:rPr>
           <w:b w:val="0"/>
@@ -27714,7 +27922,7 @@
         </w:rPr>
         <w:t>Tổng tiền</w:t>
       </w:r>
-      <w:bookmarkEnd w:id="148"/>
+      <w:bookmarkEnd w:id="147"/>
     </w:p>
     <w:p>
       <w:pPr>
@@ -27728,7 +27936,7 @@
           <w:spacing w:val="-4"/>
         </w:rPr>
       </w:pPr>
-      <w:bookmarkStart w:id="149" w:name="_Toc223433137"/>
+      <w:bookmarkStart w:id="148" w:name="_Toc223433137"/>
       <w:r>
         <w:rPr>
           <w:spacing w:val="-4"/>
@@ -27736,7 +27944,7 @@
         </w:rPr>
         <w:t>Thống kê khung giờ theo lượt khách:</w:t>
       </w:r>
-      <w:bookmarkEnd w:id="149"/>
+      <w:bookmarkEnd w:id="148"/>
     </w:p>
     <w:p>
       <w:pPr>
@@ -27751,7 +27959,7 @@
           <w:spacing w:val="-4"/>
         </w:rPr>
       </w:pPr>
-      <w:bookmarkStart w:id="150" w:name="_Toc223433138"/>
+      <w:bookmarkStart w:id="149" w:name="_Toc223433138"/>
       <w:r>
         <w:rPr>
           <w:b w:val="0"/>
@@ -27760,7 +27968,7 @@
         </w:rPr>
         <w:t>Khung giờ.</w:t>
       </w:r>
-      <w:bookmarkEnd w:id="150"/>
+      <w:bookmarkEnd w:id="149"/>
     </w:p>
     <w:p>
       <w:pPr>
@@ -27775,7 +27983,7 @@
           <w:spacing w:val="-4"/>
         </w:rPr>
       </w:pPr>
-      <w:bookmarkStart w:id="151" w:name="_Toc223433139"/>
+      <w:bookmarkStart w:id="150" w:name="_Toc223433139"/>
       <w:r>
         <w:rPr>
           <w:b w:val="0"/>
@@ -27784,7 +27992,7 @@
         </w:rPr>
         <w:t>Tổng số lượt khách dùng phòng.</w:t>
       </w:r>
-      <w:bookmarkEnd w:id="151"/>
+      <w:bookmarkEnd w:id="150"/>
     </w:p>
     <w:p>
       <w:pPr>
@@ -27799,7 +28007,7 @@
           <w:spacing w:val="-4"/>
         </w:rPr>
       </w:pPr>
-      <w:bookmarkStart w:id="152" w:name="_Toc223433140"/>
+      <w:bookmarkStart w:id="151" w:name="_Toc223433140"/>
       <w:r>
         <w:rPr>
           <w:b w:val="0"/>
@@ -27808,7 +28016,7 @@
         </w:rPr>
         <w:t>Tổng số tiền thu được.</w:t>
       </w:r>
-      <w:bookmarkEnd w:id="152"/>
+      <w:bookmarkEnd w:id="151"/>
     </w:p>
     <w:p>
       <w:pPr>
@@ -27829,7 +28037,7 @@
           <w:szCs w:val="28"/>
         </w:rPr>
       </w:pPr>
-      <w:bookmarkStart w:id="153" w:name="_Toc223433141"/>
+      <w:bookmarkStart w:id="152" w:name="_Toc223433141"/>
       <w:r>
         <w:rPr>
           <w:sz w:val="28"/>
@@ -27837,7 +28045,7 @@
         </w:rPr>
         <w:t>Câu 5: Mối quan hệ giữa các thông tin:</w:t>
       </w:r>
-      <w:bookmarkEnd w:id="153"/>
+      <w:bookmarkEnd w:id="152"/>
     </w:p>
     <w:p>
       <w:pPr>
@@ -27854,7 +28062,7 @@
           <w:lang w:val="en-US"/>
         </w:rPr>
       </w:pPr>
-      <w:bookmarkStart w:id="154" w:name="_Toc223433142"/>
+      <w:bookmarkStart w:id="153" w:name="_Toc223433142"/>
       <w:r>
         <w:rPr>
           <w:spacing w:val="-4"/>
@@ -27922,7 +28130,7 @@
         </w:rPr>
         <w:t>hòng hát.</w:t>
       </w:r>
-      <w:bookmarkEnd w:id="154"/>
+      <w:bookmarkEnd w:id="153"/>
     </w:p>
     <w:p>
       <w:pPr>
@@ -27939,7 +28147,7 @@
           <w:lang w:val="en-US"/>
         </w:rPr>
       </w:pPr>
-      <w:bookmarkStart w:id="155" w:name="_Toc223433143"/>
+      <w:bookmarkStart w:id="154" w:name="_Toc223433143"/>
       <w:r>
         <w:rPr>
           <w:spacing w:val="-4"/>
@@ -28018,7 +28226,7 @@
         </w:rPr>
         <w:t>hân viên.</w:t>
       </w:r>
-      <w:bookmarkEnd w:id="155"/>
+      <w:bookmarkEnd w:id="154"/>
     </w:p>
     <w:p>
       <w:pPr>
@@ -28035,7 +28243,7 @@
           <w:lang w:val="en-US"/>
         </w:rPr>
       </w:pPr>
-      <w:bookmarkStart w:id="156" w:name="_Toc223433144"/>
+      <w:bookmarkStart w:id="155" w:name="_Toc223433144"/>
       <w:r>
         <w:rPr>
           <w:spacing w:val="-4"/>
@@ -28171,7 +28379,7 @@
           <w:sz w:val="28"/>
           <w:szCs w:val="28"/>
         </w:rPr>
-        <w:t xml:space="preserve">hân viên </w:t>
+        <w:t xml:space="preserve">hân viên có thể </w:t>
       </w:r>
       <w:r>
         <w:rPr>
@@ -28181,20 +28389,9 @@
           <w:sz w:val="28"/>
           <w:szCs w:val="28"/>
         </w:rPr>
-        <w:lastRenderedPageBreak/>
-        <w:t xml:space="preserve">có thể </w:t>
-      </w:r>
-      <w:r>
-        <w:rPr>
-          <w:b w:val="0"/>
-          <w:bCs w:val="0"/>
-          <w:spacing w:val="-4"/>
-          <w:sz w:val="28"/>
-          <w:szCs w:val="28"/>
-        </w:rPr>
         <w:t>được phân công làm nhiều Ca làm việc khác nhau.</w:t>
       </w:r>
-      <w:bookmarkEnd w:id="156"/>
+      <w:bookmarkEnd w:id="155"/>
     </w:p>
     <w:p>
       <w:pPr>
@@ -28211,7 +28408,7 @@
           <w:lang w:val="en-US"/>
         </w:rPr>
       </w:pPr>
-      <w:bookmarkStart w:id="157" w:name="_Toc223433145"/>
+      <w:bookmarkStart w:id="156" w:name="_Toc223433145"/>
       <w:r>
         <w:rPr>
           <w:spacing w:val="-4"/>
@@ -28231,7 +28428,7 @@
         </w:rPr>
         <w:t xml:space="preserve"> 1 Khách hàng (người đại diện) có thể đứng tên thanh toán nhiều Hóa đơn (ở các lần đến quán khác nhau). 1 Hóa đơn chỉ do duy nhất 1 Khách hàng đại diện thanh toán.</w:t>
       </w:r>
-      <w:bookmarkEnd w:id="157"/>
+      <w:bookmarkEnd w:id="156"/>
     </w:p>
     <w:p>
       <w:pPr>
@@ -28248,7 +28445,7 @@
           <w:lang w:val="en-US"/>
         </w:rPr>
       </w:pPr>
-      <w:bookmarkStart w:id="158" w:name="_Toc223433146"/>
+      <w:bookmarkStart w:id="157" w:name="_Toc223433146"/>
       <w:r>
         <w:rPr>
           <w:spacing w:val="-4"/>
@@ -28314,7 +28511,7 @@
         </w:rPr>
         <w:t>Tại một thời điểm xác định, 1 Phòng hát chỉ có tối đa 1 Hóa đơn chưa thanh toán (tương ứng với 1 nhóm khách đang hát).</w:t>
       </w:r>
-      <w:bookmarkEnd w:id="158"/>
+      <w:bookmarkEnd w:id="157"/>
     </w:p>
     <w:p>
       <w:pPr>
@@ -28331,7 +28528,7 @@
           <w:lang w:val="en-US"/>
         </w:rPr>
       </w:pPr>
-      <w:bookmarkStart w:id="159" w:name="_Toc223433147"/>
+      <w:bookmarkStart w:id="158" w:name="_Toc223433147"/>
       <w:r>
         <w:rPr>
           <w:spacing w:val="-4"/>
@@ -28370,7 +28567,7 @@
         </w:rPr>
         <w:t>1 Hóa đơn có thể bao gồm nhiều Mặt hàng khác nhau. 1 Mặt hàng có thể xuất hiện trong nhiều Hóa đơn khác nhau.</w:t>
       </w:r>
-      <w:bookmarkEnd w:id="159"/>
+      <w:bookmarkEnd w:id="158"/>
       <w:r>
         <w:rPr>
           <w:b w:val="0"/>
@@ -28397,7 +28594,7 @@
           <w:lang w:val="en-US"/>
         </w:rPr>
       </w:pPr>
-      <w:bookmarkStart w:id="160" w:name="_Toc223433148"/>
+      <w:bookmarkStart w:id="159" w:name="_Toc223433148"/>
       <w:r>
         <w:rPr>
           <w:spacing w:val="-4"/>
@@ -28443,7 +28640,7 @@
         </w:rPr>
         <w:t>1 Nhân viên có thể bị ghi nhận nhiều Khoản phạt. 1 Khoản phạt chỉ áp dụng cho duy nhất 1 Nhân viên.</w:t>
       </w:r>
-      <w:bookmarkEnd w:id="160"/>
+      <w:bookmarkEnd w:id="159"/>
     </w:p>
     <w:p>
       <w:pPr>
@@ -28459,7 +28656,7 @@
           <w:szCs w:val="28"/>
         </w:rPr>
       </w:pPr>
-      <w:bookmarkStart w:id="161" w:name="_Toc223433149"/>
+      <w:bookmarkStart w:id="160" w:name="_Toc223433149"/>
       <w:r>
         <w:rPr>
           <w:spacing w:val="-4"/>
@@ -28524,7 +28721,7 @@
         </w:rPr>
         <w:t>dưới.</w:t>
       </w:r>
-      <w:bookmarkEnd w:id="161"/>
+      <w:bookmarkEnd w:id="160"/>
     </w:p>
     <w:p>
       <w:pPr>
@@ -28547,7 +28744,7 @@
         </w:numPr>
         <w:ind w:left="1418" w:hanging="851"/>
       </w:pPr>
-      <w:bookmarkStart w:id="162" w:name="_Toc223433150"/>
+      <w:bookmarkStart w:id="161" w:name="_Toc223433150"/>
       <w:r>
         <w:rPr>
           <w:sz w:val="32"/>
@@ -28555,7 +28752,7 @@
         </w:rPr>
         <w:t>Mô hình nghiệp vụ bằng UML:</w:t>
       </w:r>
-      <w:bookmarkEnd w:id="162"/>
+      <w:bookmarkEnd w:id="161"/>
     </w:p>
     <w:p>
       <w:pPr>
@@ -28572,7 +28769,7 @@
           <w:u w:val="single"/>
         </w:rPr>
       </w:pPr>
-      <w:bookmarkStart w:id="163" w:name="_Toc223433151"/>
+      <w:bookmarkStart w:id="162" w:name="_Toc223433151"/>
       <w:r>
         <w:rPr>
           <w:spacing w:val="-4"/>
@@ -28609,7 +28806,7 @@
         </w:rPr>
         <w:t>:</w:t>
       </w:r>
-      <w:bookmarkEnd w:id="163"/>
+      <w:bookmarkEnd w:id="162"/>
     </w:p>
     <w:p>
       <w:pPr>
@@ -28626,20 +28823,20 @@
           <w:szCs w:val="32"/>
         </w:rPr>
       </w:pPr>
-      <w:bookmarkStart w:id="164" w:name="_bookmark8"/>
-      <w:bookmarkStart w:id="165" w:name="_bookmark10"/>
-      <w:bookmarkStart w:id="166" w:name="_Toc223433152"/>
+      <w:bookmarkStart w:id="163" w:name="_bookmark8"/>
+      <w:bookmarkStart w:id="164" w:name="_bookmark10"/>
+      <w:bookmarkStart w:id="165" w:name="_Toc223433152"/>
+      <w:bookmarkEnd w:id="163"/>
       <w:bookmarkEnd w:id="164"/>
+      <w:r>
+        <w:rPr>
+          <w:b w:val="0"/>
+          <w:bCs w:val="0"/>
+          <w:spacing w:val="-4"/>
+        </w:rPr>
+        <w:t>Actors:</w:t>
+      </w:r>
       <w:bookmarkEnd w:id="165"/>
-      <w:r>
-        <w:rPr>
-          <w:b w:val="0"/>
-          <w:bCs w:val="0"/>
-          <w:spacing w:val="-4"/>
-        </w:rPr>
-        <w:t>Actors:</w:t>
-      </w:r>
-      <w:bookmarkEnd w:id="166"/>
     </w:p>
     <w:p>
       <w:pPr>
@@ -28656,7 +28853,7 @@
           <w:szCs w:val="32"/>
         </w:rPr>
       </w:pPr>
-      <w:bookmarkStart w:id="167" w:name="_Toc223433153"/>
+      <w:bookmarkStart w:id="166" w:name="_Toc223433153"/>
       <w:r>
         <w:rPr>
           <w:b w:val="0"/>
@@ -28687,7 +28884,7 @@
         </w:rPr>
         <w:t xml:space="preserve"> Actor trừu tượng: Nhân viên quán Karaoke.</w:t>
       </w:r>
-      <w:bookmarkEnd w:id="167"/>
+      <w:bookmarkEnd w:id="166"/>
     </w:p>
     <w:p>
       <w:pPr>
@@ -28704,7 +28901,7 @@
           <w:szCs w:val="32"/>
         </w:rPr>
       </w:pPr>
-      <w:bookmarkStart w:id="168" w:name="_Toc223433154"/>
+      <w:bookmarkStart w:id="167" w:name="_Toc223433154"/>
       <w:r>
         <w:rPr>
           <w:b w:val="0"/>
@@ -28715,7 +28912,7 @@
         </w:rPr>
         <w:t>Actor là tác nhân phụ bao gồm: Khách hàng (do không trực tiếp sử dụng ứng dụng nhưng trong 1 số chức năng vẫn phải có mặt mới thực hiện được)</w:t>
       </w:r>
-      <w:bookmarkEnd w:id="168"/>
+      <w:bookmarkEnd w:id="167"/>
       <w:r>
         <w:rPr>
           <w:b w:val="0"/>
@@ -28754,7 +28951,7 @@
           <w:szCs w:val="32"/>
         </w:rPr>
       </w:pPr>
-      <w:bookmarkStart w:id="169" w:name="_Toc223433155"/>
+      <w:bookmarkStart w:id="168" w:name="_Toc223433155"/>
       <w:r>
         <w:rPr>
           <w:b w:val="0"/>
@@ -28763,7 +28960,7 @@
         </w:rPr>
         <w:t>Use cases:</w:t>
       </w:r>
-      <w:bookmarkEnd w:id="169"/>
+      <w:bookmarkEnd w:id="168"/>
     </w:p>
     <w:p>
       <w:pPr>
@@ -28780,7 +28977,7 @@
           <w:szCs w:val="28"/>
         </w:rPr>
       </w:pPr>
-      <w:bookmarkStart w:id="170" w:name="_Toc223433156"/>
+      <w:bookmarkStart w:id="169" w:name="_Toc223433156"/>
       <w:r>
         <w:rPr>
           <w:b w:val="0"/>
@@ -28791,7 +28988,7 @@
         </w:rPr>
         <w:t>Nhân viên lễ tân: Tiếp nhận khách hàng, Thanh toán cho khách.</w:t>
       </w:r>
-      <w:bookmarkEnd w:id="170"/>
+      <w:bookmarkEnd w:id="169"/>
     </w:p>
     <w:p>
       <w:pPr>
@@ -28808,7 +29005,7 @@
           <w:szCs w:val="32"/>
         </w:rPr>
       </w:pPr>
-      <w:bookmarkStart w:id="171" w:name="_Toc223433157"/>
+      <w:bookmarkStart w:id="170" w:name="_Toc223433157"/>
       <w:r>
         <w:rPr>
           <w:b w:val="0"/>
@@ -28827,7 +29024,7 @@
         </w:rPr>
         <w:t>.</w:t>
       </w:r>
-      <w:bookmarkEnd w:id="171"/>
+      <w:bookmarkEnd w:id="170"/>
     </w:p>
     <w:p>
       <w:pPr>
@@ -28856,12 +29053,11 @@
           <w:szCs w:val="32"/>
         </w:rPr>
       </w:pPr>
-      <w:bookmarkStart w:id="172" w:name="_Toc223433158"/>
+      <w:bookmarkStart w:id="171" w:name="_Toc223433158"/>
       <w:r>
         <w:rPr>
           <w:noProof/>
         </w:rPr>
-        <w:lastRenderedPageBreak/>
         <w:drawing>
           <wp:anchor distT="0" distB="0" distL="114300" distR="114300" simplePos="0" relativeHeight="251660800" behindDoc="0" locked="0" layoutInCell="1" allowOverlap="1" wp14:anchorId="3F3460F2" wp14:editId="29689AA4">
             <wp:simplePos x="0" y="0"/>
@@ -28943,7 +29139,7 @@
         </w:rPr>
         <w:t>:</w:t>
       </w:r>
-      <w:bookmarkEnd w:id="172"/>
+      <w:bookmarkEnd w:id="171"/>
     </w:p>
     <w:p>
       <w:pPr>
@@ -28972,7 +29168,7 @@
           <w:szCs w:val="32"/>
         </w:rPr>
       </w:pPr>
-      <w:bookmarkStart w:id="173" w:name="_Toc223433159"/>
+      <w:bookmarkStart w:id="172" w:name="_Toc223433159"/>
       <w:r>
         <w:rPr>
           <w:b w:val="0"/>
@@ -28981,7 +29177,7 @@
         </w:rPr>
         <w:t>Mô tả use case:</w:t>
       </w:r>
-      <w:bookmarkEnd w:id="173"/>
+      <w:bookmarkEnd w:id="172"/>
     </w:p>
     <w:p>
       <w:pPr>
@@ -28998,7 +29194,7 @@
           <w:szCs w:val="32"/>
         </w:rPr>
       </w:pPr>
-      <w:bookmarkStart w:id="174" w:name="_Toc223433160"/>
+      <w:bookmarkStart w:id="173" w:name="_Toc223433160"/>
       <w:r>
         <w:rPr>
           <w:b w:val="0"/>
@@ -29050,7 +29246,7 @@
         </w:rPr>
         <w:t>Tiếp nhận khách hàng theo yêu cầu của Khách hàng.</w:t>
       </w:r>
-      <w:bookmarkEnd w:id="174"/>
+      <w:bookmarkEnd w:id="173"/>
     </w:p>
     <w:p>
       <w:pPr>
@@ -29067,7 +29263,7 @@
           <w:szCs w:val="32"/>
         </w:rPr>
       </w:pPr>
-      <w:bookmarkStart w:id="175" w:name="_Toc223433161"/>
+      <w:bookmarkStart w:id="174" w:name="_Toc223433161"/>
       <w:r>
         <w:rPr>
           <w:b w:val="0"/>
@@ -29078,7 +29274,7 @@
         </w:rPr>
         <w:t>Thanh toán cho khách: UC này cho phép Nhân viên lễ tân Thanh toán cho khách theo yêu cầu của Khách hàng.</w:t>
       </w:r>
-      <w:bookmarkEnd w:id="175"/>
+      <w:bookmarkEnd w:id="174"/>
     </w:p>
     <w:p>
       <w:pPr>
@@ -29095,7 +29291,7 @@
           <w:szCs w:val="32"/>
         </w:rPr>
       </w:pPr>
-      <w:bookmarkStart w:id="176" w:name="_Toc223433162"/>
+      <w:bookmarkStart w:id="175" w:name="_Toc223433162"/>
       <w:r>
         <w:rPr>
           <w:b w:val="0"/>
@@ -29106,7 +29302,7 @@
         </w:rPr>
         <w:t>Tính công nhân viên: UC này cho phép Quản lí Tính công nhân viên.</w:t>
       </w:r>
-      <w:bookmarkEnd w:id="176"/>
+      <w:bookmarkEnd w:id="175"/>
     </w:p>
     <w:p>
       <w:pPr>
@@ -29123,7 +29319,7 @@
           <w:szCs w:val="32"/>
         </w:rPr>
       </w:pPr>
-      <w:bookmarkStart w:id="177" w:name="_Toc223433163"/>
+      <w:bookmarkStart w:id="176" w:name="_Toc223433163"/>
       <w:r>
         <w:rPr>
           <w:b w:val="0"/>
@@ -29145,7 +29341,7 @@
         </w:rPr>
         <w:t xml:space="preserve"> kê khung giờ theo lượt khách: UC này cho phép Quản lí Thống kê khung giờ theo lượt khách.</w:t>
       </w:r>
-      <w:bookmarkEnd w:id="177"/>
+      <w:bookmarkEnd w:id="176"/>
       <w:r>
         <w:rPr>
           <w:spacing w:val="-4"/>
@@ -34502,10 +34698,6 @@
 </file>
 
 <file path=customXml/item1.xml><?xml version="1.0" encoding="utf-8"?>
-<b:Sources xmlns:b="http://schemas.openxmlformats.org/officeDocument/2006/bibliography" xmlns="http://schemas.openxmlformats.org/officeDocument/2006/bibliography" SelectedStyle="\APASixthEditionOfficeOnline.xsl" StyleName="APA" Version="6"/>
-</file>
-
-<file path=customXml/item2.xml><?xml version="1.0" encoding="utf-8"?>
 <p:properties xmlns:p="http://schemas.microsoft.com/office/2006/metadata/properties" xmlns:xsi="http://www.w3.org/2001/XMLSchema-instance" xmlns:pc="http://schemas.microsoft.com/office/infopath/2007/PartnerControls">
   <documentManagement>
     <_activity xmlns="021e1b51-7224-41ca-9a1f-2e1658403c4a" xsi:nil="true"/>
@@ -34513,7 +34705,20 @@
 </p:properties>
 </file>
 
+<file path=customXml/item2.xml><?xml version="1.0" encoding="utf-8"?>
+<b:Sources xmlns:b="http://schemas.openxmlformats.org/officeDocument/2006/bibliography" xmlns="http://schemas.openxmlformats.org/officeDocument/2006/bibliography" SelectedStyle="\APASixthEditionOfficeOnline.xsl" StyleName="APA" Version="6"/>
+</file>
+
 <file path=customXml/item3.xml><?xml version="1.0" encoding="utf-8"?>
+<?mso-contentType ?>
+<FormTemplates xmlns="http://schemas.microsoft.com/sharepoint/v3/contenttype/forms">
+  <Display>DocumentLibraryForm</Display>
+  <Edit>DocumentLibraryForm</Edit>
+  <New>DocumentLibraryForm</New>
+</FormTemplates>
+</file>
+
+<file path=customXml/item4.xml><?xml version="1.0" encoding="utf-8"?>
 <ct:contentTypeSchema xmlns:ct="http://schemas.microsoft.com/office/2006/metadata/contentType" xmlns:ma="http://schemas.microsoft.com/office/2006/metadata/properties/metaAttributes" ct:_="" ma:_="" ma:contentTypeName="Document" ma:contentTypeID="0x01010025E29E87B7888F4A99A660B3ACACA4C0" ma:contentTypeVersion="6" ma:contentTypeDescription="Create a new document." ma:contentTypeScope="" ma:versionID="e2e760d3cac2d267c418706fad2c560a">
   <xsd:schema xmlns:xsd="http://www.w3.org/2001/XMLSchema" xmlns:xs="http://www.w3.org/2001/XMLSchema" xmlns:p="http://schemas.microsoft.com/office/2006/metadata/properties" xmlns:ns3="021e1b51-7224-41ca-9a1f-2e1658403c4a" targetNamespace="http://schemas.microsoft.com/office/2006/metadata/properties" ma:root="true" ma:fieldsID="e199dc1f98b3f3daa0c91ab532a740a3" ns3:_="">
     <xsd:import namespace="021e1b51-7224-41ca-9a1f-2e1658403c4a"/>
@@ -34669,24 +34874,7 @@
 </ct:contentTypeSchema>
 </file>
 
-<file path=customXml/item4.xml><?xml version="1.0" encoding="utf-8"?>
-<?mso-contentType ?>
-<FormTemplates xmlns="http://schemas.microsoft.com/sharepoint/v3/contenttype/forms">
-  <Display>DocumentLibraryForm</Display>
-  <Edit>DocumentLibraryForm</Edit>
-  <New>DocumentLibraryForm</New>
-</FormTemplates>
-</file>
-
 <file path=customXml/itemProps1.xml><?xml version="1.0" encoding="utf-8"?>
-<ds:datastoreItem xmlns:ds="http://schemas.openxmlformats.org/officeDocument/2006/customXml" ds:itemID="{0695DD06-5E40-41C8-9666-788884D2EC6B}">
-  <ds:schemaRefs>
-    <ds:schemaRef ds:uri="http://schemas.openxmlformats.org/officeDocument/2006/bibliography"/>
-  </ds:schemaRefs>
-</ds:datastoreItem>
-</file>
-
-<file path=customXml/itemProps2.xml><?xml version="1.0" encoding="utf-8"?>
 <ds:datastoreItem xmlns:ds="http://schemas.openxmlformats.org/officeDocument/2006/customXml" ds:itemID="{DC2B70DC-B790-4A07-9BAE-BF3FE50B6C19}">
   <ds:schemaRefs>
     <ds:schemaRef ds:uri="http://schemas.microsoft.com/office/2006/metadata/properties"/>
@@ -34696,7 +34884,23 @@
 </ds:datastoreItem>
 </file>
 
+<file path=customXml/itemProps2.xml><?xml version="1.0" encoding="utf-8"?>
+<ds:datastoreItem xmlns:ds="http://schemas.openxmlformats.org/officeDocument/2006/customXml" ds:itemID="{0695DD06-5E40-41C8-9666-788884D2EC6B}">
+  <ds:schemaRefs>
+    <ds:schemaRef ds:uri="http://schemas.openxmlformats.org/officeDocument/2006/bibliography"/>
+  </ds:schemaRefs>
+</ds:datastoreItem>
+</file>
+
 <file path=customXml/itemProps3.xml><?xml version="1.0" encoding="utf-8"?>
+<ds:datastoreItem xmlns:ds="http://schemas.openxmlformats.org/officeDocument/2006/customXml" ds:itemID="{E108C629-D538-4036-839C-BC1EEBF7E4CA}">
+  <ds:schemaRefs>
+    <ds:schemaRef ds:uri="http://schemas.microsoft.com/sharepoint/v3/contenttype/forms"/>
+  </ds:schemaRefs>
+</ds:datastoreItem>
+</file>
+
+<file path=customXml/itemProps4.xml><?xml version="1.0" encoding="utf-8"?>
 <ds:datastoreItem xmlns:ds="http://schemas.openxmlformats.org/officeDocument/2006/customXml" ds:itemID="{DD43A3C8-5124-4EED-BE80-5C883A6108F1}">
   <ds:schemaRefs>
     <ds:schemaRef ds:uri="http://schemas.microsoft.com/office/2006/metadata/contentType"/>
@@ -34712,12 +34916,4 @@
     <ds:schemaRef ds:uri="http://schemas.microsoft.com/internal/obd"/>
   </ds:schemaRefs>
 </ds:datastoreItem>
-</file>
-
-<file path=customXml/itemProps4.xml><?xml version="1.0" encoding="utf-8"?>
-<ds:datastoreItem xmlns:ds="http://schemas.openxmlformats.org/officeDocument/2006/customXml" ds:itemID="{E108C629-D538-4036-839C-BC1EEBF7E4CA}">
-  <ds:schemaRefs>
-    <ds:schemaRef ds:uri="http://schemas.microsoft.com/sharepoint/v3/contenttype/forms"/>
-  </ds:schemaRefs>
-</ds:datastoreItem>
 </file>
</xml_diff>